<commit_message>
docs(models): Added to the report the 1 Rule, naive bayes and induction tree models implementation and usage
</commit_message>
<xml_diff>
--- a/PROJECT_A/report_projeto_a.docx
+++ b/PROJECT_A/report_projeto_a.docx
@@ -1249,11 +1249,11 @@
             <wp:effectExtent l="0" t="0" r="0" b="0"/>
             <wp:wrapTight wrapText="bothSides">
               <wp:wrapPolygon edited="0">
-                <wp:start x="-10" y="0"/>
-                <wp:lineTo x="-10" y="21265"/>
-                <wp:lineTo x="21389" y="21265"/>
-                <wp:lineTo x="21389" y="0"/>
-                <wp:lineTo x="-10" y="0"/>
+                <wp:start x="-16" y="0"/>
+                <wp:lineTo x="-16" y="21260"/>
+                <wp:lineTo x="21383" y="21260"/>
+                <wp:lineTo x="21383" y="0"/>
+                <wp:lineTo x="-16" y="0"/>
               </wp:wrapPolygon>
             </wp:wrapTight>
             <wp:docPr id="1" name="Imagem 2" descr="Uma imagem com texto, captura de ecrã, número, Tipo de letra&#10;&#10;Os conteúdos gerados por IA podem estar incorretos."/>
@@ -1575,11 +1575,11 @@
             <wp:effectExtent l="0" t="0" r="0" b="0"/>
             <wp:wrapTight wrapText="bothSides">
               <wp:wrapPolygon edited="0">
-                <wp:start x="-9" y="0"/>
-                <wp:lineTo x="-9" y="21455"/>
-                <wp:lineTo x="21510" y="21455"/>
-                <wp:lineTo x="21510" y="0"/>
-                <wp:lineTo x="-9" y="0"/>
+                <wp:start x="-15" y="0"/>
+                <wp:lineTo x="-15" y="21451"/>
+                <wp:lineTo x="21504" y="21451"/>
+                <wp:lineTo x="21504" y="0"/>
+                <wp:lineTo x="-15" y="0"/>
               </wp:wrapPolygon>
             </wp:wrapTight>
             <wp:docPr id="2" name="Imagem 3" descr="Uma imagem com texto, captura de ecrã, número, diagrama&#10;&#10;Os conteúdos gerados por IA podem estar incorretos."/>
@@ -1940,11 +1940,11 @@
             <wp:effectExtent l="0" t="0" r="0" b="0"/>
             <wp:wrapTight wrapText="bothSides">
               <wp:wrapPolygon edited="0">
-                <wp:start x="-9" y="0"/>
-                <wp:lineTo x="-9" y="21310"/>
-                <wp:lineTo x="21500" y="21310"/>
-                <wp:lineTo x="21500" y="0"/>
-                <wp:lineTo x="-9" y="0"/>
+                <wp:start x="-15" y="0"/>
+                <wp:lineTo x="-15" y="21302"/>
+                <wp:lineTo x="21494" y="21302"/>
+                <wp:lineTo x="21494" y="0"/>
+                <wp:lineTo x="-15" y="0"/>
               </wp:wrapPolygon>
             </wp:wrapTight>
             <wp:docPr id="3" name="Imagem 1" descr="Uma imagem com texto, Tipo de letra, número, file&#10;&#10;Os conteúdos gerados por IA podem estar incorretos."/>
@@ -2240,11 +2240,11 @@
             <wp:effectExtent l="0" t="0" r="0" b="0"/>
             <wp:wrapTight wrapText="bothSides">
               <wp:wrapPolygon edited="0">
-                <wp:start x="-11" y="0"/>
-                <wp:lineTo x="-11" y="21382"/>
-                <wp:lineTo x="21414" y="21382"/>
-                <wp:lineTo x="21414" y="0"/>
-                <wp:lineTo x="-11" y="0"/>
+                <wp:start x="-19" y="0"/>
+                <wp:lineTo x="-19" y="21376"/>
+                <wp:lineTo x="21407" y="21376"/>
+                <wp:lineTo x="21407" y="0"/>
+                <wp:lineTo x="-19" y="0"/>
               </wp:wrapPolygon>
             </wp:wrapTight>
             <wp:docPr id="4" name="Image2" descr="Uma imagem com texto, captura de ecrã, Tipo de letra, número&#10;&#10;Os conteúdos gerados por IA podem estar incorretos."/>
@@ -2621,20 +2621,7 @@
           <w:lang w:val="pt-PT" w:eastAsia="en-US" w:bidi="ar-SA"/>
           <w14:ligatures w14:val="standardContextual"/>
         </w:rPr>
-        <w:t>Para descobrir a taxa de erro para cada atributo, especialmente com valores discretos, de uma dataset é necessário calcular a partir da seguinte fórmul</w:t>
-      </w:r>
-      <w:r>
-        <w:rPr>
-          <w:rFonts w:eastAsia="TimesNewRomanPSMT" w:cs="TimesNewRomanPSMT" w:ascii="TimesNewRomanPSMT" w:hAnsi="TimesNewRomanPSMT"/>
-          <w:color w:val="000000"/>
-          <w:kern w:val="2"/>
-          <w:sz w:val="22"/>
-          <w:szCs w:val="22"/>
-          <w:shd w:fill="FFFF00" w:val="clear"/>
-          <w:lang w:val="pt-PT" w:eastAsia="en-US" w:bidi="ar-SA"/>
-          <w14:ligatures w14:val="standardContextual"/>
-        </w:rPr>
-        <w:t>a matemática:</w:t>
+        <w:t>Para descobrir a taxa de erro para cada atributo, especialmente com valores discretos, de uma dataset é necessário calcular a partir da seguinte fórmula matemática:</w:t>
       </w:r>
     </w:p>
     <w:p>
@@ -2663,20 +2650,7 @@
           <w:lang w:val="pt-PT" w:eastAsia="en-US" w:bidi="ar-SA"/>
           <w14:ligatures w14:val="standardContextual"/>
         </w:rPr>
-        <w:t>D</w:t>
-      </w:r>
-      <w:r>
-        <w:rPr>
-          <w:rFonts w:eastAsia="TimesNewRomanPSMT" w:cs="TimesNewRomanPSMT" w:ascii="TimesNewRomanPSMT" w:hAnsi="TimesNewRomanPSMT"/>
-          <w:color w:val="000000"/>
-          <w:kern w:val="2"/>
-          <w:sz w:val="22"/>
-          <w:szCs w:val="22"/>
-          <w:shd w:fill="FFFF00" w:val="clear"/>
-          <w:lang w:val="pt-PT" w:eastAsia="en-US" w:bidi="ar-SA"/>
-          <w14:ligatures w14:val="standardContextual"/>
-        </w:rPr>
-        <w:t>ados:</w:t>
+        <w:t>Dados:</w:t>
       </w:r>
     </w:p>
     <w:p>
@@ -2731,19 +2705,7 @@
       </w:pPr>
       <w:r>
         <w:rPr/>
-        <w:t>F: a feature (</w:t>
-      </w:r>
-      <w:r>
-        <w:rPr/>
-        <w:t>atributo</w:t>
-      </w:r>
-      <w:r>
-        <w:rPr/>
-        <w:t>)</w:t>
-      </w:r>
-      <w:r>
-        <w:rPr/>
-        <w:t>na dataset</w:t>
+        <w:t>F: a feature (atributo)na dataset</w:t>
       </w:r>
     </w:p>
     <w:p>
@@ -2766,11 +2728,7 @@
       </w:pPr>
       <w:r>
         <w:rPr/>
-        <w:t xml:space="preserve">VF​={v1​,v2​,...,vk​}:  </w:t>
-      </w:r>
-      <w:r>
-        <w:rPr/>
-        <w:t>todos os poss</w:t>
+        <w:t>VF​={v1​,v2​,...,vk​}:  todos os poss</w:t>
       </w:r>
       <w:r>
         <w:rPr>
@@ -2786,15 +2744,7 @@
       </w:r>
       <w:r>
         <w:rPr/>
-        <w:t xml:space="preserve"> </w:t>
-      </w:r>
-      <w:r>
-        <w:rPr/>
-        <w:t>de</w:t>
-      </w:r>
-      <w:r>
-        <w:rPr/>
-        <w:t xml:space="preserve"> F</w:t>
+        <w:t xml:space="preserve"> de F</w:t>
       </w:r>
     </w:p>
     <w:p>
@@ -2817,11 +2767,7 @@
       </w:pPr>
       <w:r>
         <w:rPr/>
-        <w:t>C:</w:t>
-      </w:r>
-      <w:r>
-        <w:rPr/>
-        <w:t>vari</w:t>
+        <w:t>C:vari</w:t>
       </w:r>
       <w:r>
         <w:rPr>
@@ -2856,15 +2802,7 @@
       </w:pPr>
       <w:r>
         <w:rPr/>
-        <w:t xml:space="preserve">DF=vi​​⊆D: </w:t>
-      </w:r>
-      <w:r>
-        <w:rPr/>
-        <w:t>subconjunto de amostras onde a feature</w:t>
-      </w:r>
-      <w:r>
-        <w:rPr/>
-        <w:t xml:space="preserve"> F=vi​</w:t>
+        <w:t>DF=vi​​⊆D: subconjunto de amostras onde a feature F=vi​</w:t>
       </w:r>
     </w:p>
     <w:p>
@@ -2906,7 +2844,13 @@
         </w:rPr>
       </w:pPr>
       <w:r>
-        <w:rPr/>
+        <w:rPr>
+          <w:rFonts w:eastAsia="TimesNewRomanPSMT" w:cs="TimesNewRomanPSMT" w:ascii="TimesNewRomanPSMT" w:hAnsi="TimesNewRomanPSMT"/>
+          <w:color w:val="000000"/>
+          <w:sz w:val="22"/>
+          <w:szCs w:val="22"/>
+          <w:shd w:fill="FFFF00" w:val="clear"/>
+        </w:rPr>
       </w:r>
     </w:p>
     <w:p>
@@ -2996,18 +2940,6 @@
         </w:rPr>
         <w:tab/>
         <w:tab/>
-      </w:r>
-      <w:r>
-        <w:rPr>
-          <w:rFonts w:eastAsia="TimesNewRomanPSMT" w:cs="TimesNewRomanPSMT" w:ascii="TimesNewRomanPSMT" w:hAnsi="TimesNewRomanPSMT"/>
-          <w:color w:val="000000"/>
-          <w:kern w:val="2"/>
-          <w:sz w:val="22"/>
-          <w:szCs w:val="22"/>
-          <w:shd w:fill="FFFF00" w:val="clear"/>
-          <w:lang w:val="pt-PT" w:eastAsia="en-US" w:bidi="ar-SA"/>
-          <w14:ligatures w14:val="standardContextual"/>
-        </w:rPr>
         <w:t>For each value vi​:</w:t>
       </w:r>
     </w:p>
@@ -3081,9 +3013,6 @@
       <w:r>
         <w:rPr/>
         <w:tab/>
-      </w:r>
-      <w:r>
-        <w:rPr/>
         <w:t>Regra de classificaç</w:t>
       </w:r>
       <w:r>
@@ -3137,22 +3066,34 @@
         </w:rPr>
       </w:pPr>
       <w:r>
-        <w:rPr/>
-      </w:r>
-    </w:p>
-    <w:p>
-      <w:pPr>
-        <w:pStyle w:val="TextBody"/>
-        <w:rPr>
-          <w:rFonts w:ascii="TimesNewRomanPSMT" w:hAnsi="TimesNewRomanPSMT" w:eastAsia="TimesNewRomanPSMT" w:cs="TimesNewRomanPSMT"/>
+        <w:rPr>
+          <w:rFonts w:eastAsia="TimesNewRomanPSMT" w:cs="TimesNewRomanPSMT" w:ascii="TimesNewRomanPSMT" w:hAnsi="TimesNewRomanPSMT"/>
           <w:color w:val="000000"/>
           <w:sz w:val="22"/>
           <w:szCs w:val="22"/>
           <w:shd w:fill="FFFF00" w:val="clear"/>
         </w:rPr>
-      </w:pPr>
-      <w:r>
-        <w:rPr/>
+      </w:r>
+    </w:p>
+    <w:p>
+      <w:pPr>
+        <w:pStyle w:val="TextBody"/>
+        <w:rPr>
+          <w:rFonts w:ascii="TimesNewRomanPSMT" w:hAnsi="TimesNewRomanPSMT" w:eastAsia="TimesNewRomanPSMT" w:cs="TimesNewRomanPSMT"/>
+          <w:color w:val="000000"/>
+          <w:sz w:val="22"/>
+          <w:szCs w:val="22"/>
+          <w:shd w:fill="FFFF00" w:val="clear"/>
+        </w:rPr>
+      </w:pPr>
+      <w:r>
+        <w:rPr>
+          <w:rFonts w:eastAsia="TimesNewRomanPSMT" w:cs="TimesNewRomanPSMT" w:ascii="TimesNewRomanPSMT" w:hAnsi="TimesNewRomanPSMT"/>
+          <w:color w:val="000000"/>
+          <w:sz w:val="22"/>
+          <w:szCs w:val="22"/>
+          <w:shd w:fill="FFFF00" w:val="clear"/>
+        </w:rPr>
       </w:r>
     </w:p>
     <w:p>
@@ -3208,9 +3149,8 @@
           <w:sz w:val="24"/>
           <w:szCs w:val="24"/>
           <w:shd w:fill="FFFF00" w:val="clear"/>
-          <w:lang w:val="en-US"/>
-        </w:rPr>
-        <w:t xml:space="preserve">The classifiers of induction tree and naive bases are models that are giving better accuracy compared to one Rule that uses a unique variable but for this case where we have a small dataset we observed that One Rule is sufficient for the case we have. Since one rule chooses the best category and creates simple rules its highly interpretable, fast and its good as a baseline. Naive bayes estimates probabilities assuming that there is conditional independence between atributes. Naive bayes its more efficient and more robust in big data sets. </w:t>
+        </w:rPr>
+        <w:t xml:space="preserve">Os classificadores de </w:t>
       </w:r>
       <w:r>
         <w:rPr>
@@ -3222,7 +3162,7 @@
           <w:szCs w:val="24"/>
           <w:shd w:fill="FFFF00" w:val="clear"/>
         </w:rPr>
-        <w:t xml:space="preserve">Decision trees recursively partition the attribute, capture interactions, and handle continuous and </w:t>
+        <w:t xml:space="preserve">induction tree </w:t>
       </w:r>
       <w:r>
         <w:rPr>
@@ -3233,9 +3173,8 @@
           <w:sz w:val="24"/>
           <w:szCs w:val="24"/>
           <w:shd w:fill="FFFF00" w:val="clear"/>
-          <w:lang w:val="en-US"/>
-        </w:rPr>
-        <w:t>variables</w:t>
+        </w:rPr>
+        <w:t xml:space="preserve">e </w:t>
       </w:r>
       <w:r>
         <w:rPr>
@@ -3247,7 +3186,7 @@
           <w:szCs w:val="24"/>
           <w:shd w:fill="FFFF00" w:val="clear"/>
         </w:rPr>
-        <w:t xml:space="preserve"> however, they tend to overfit without </w:t>
+        <w:t>naive bayes</w:t>
       </w:r>
       <w:r>
         <w:rPr>
@@ -3258,9 +3197,8 @@
           <w:sz w:val="24"/>
           <w:szCs w:val="24"/>
           <w:shd w:fill="FFFF00" w:val="clear"/>
-          <w:lang w:val="en-US"/>
-        </w:rPr>
-        <w:t>extraction</w:t>
+        </w:rPr>
+        <w:t xml:space="preserve"> são modelos que apresentam melhor precisão em comparação com </w:t>
       </w:r>
       <w:r>
         <w:rPr>
@@ -3272,7 +3210,57 @@
           <w:szCs w:val="24"/>
           <w:shd w:fill="FFFF00" w:val="clear"/>
         </w:rPr>
-        <w:t xml:space="preserve"> or regularization. In terms of computational cost, One Rule is trivial, Naive Bayes is linear and very fast, and trees can be more expensive to train depending on the depth and size of the data. In terms of interpretability, One Rule is the simplest, the tree provides understandable local rules, and Naive Bayes gives probabilities whose justification is less intuitive. In practice, using One Rule as a baseline is useful; choose between Naive Bayes and a tree depending on the presence of complex interactions (tree) or the need for speed and probabilistic simplicity (Naive Bayes).</w:t>
+        <w:t xml:space="preserve">o algoritmo 1 Rule </w:t>
+      </w:r>
+      <w:r>
+        <w:rPr>
+          <w:rFonts w:eastAsia="TimesNewRomanPS-BoldMT" w:cs="TimesNewRomanPS-BoldMT" w:ascii="TimesNewRomanPS-BoldMT" w:hAnsi="TimesNewRomanPS-BoldMT"/>
+          <w:b/>
+          <w:bCs/>
+          <w:color w:val="000000"/>
+          <w:sz w:val="24"/>
+          <w:szCs w:val="24"/>
+          <w:shd w:fill="FFFF00" w:val="clear"/>
+        </w:rPr>
+        <w:t xml:space="preserve">que utiliza </w:t>
+      </w:r>
+      <w:r>
+        <w:rPr>
+          <w:rFonts w:eastAsia="TimesNewRomanPS-BoldMT" w:cs="TimesNewRomanPS-BoldMT" w:ascii="TimesNewRomanPS-BoldMT" w:hAnsi="TimesNewRomanPS-BoldMT"/>
+          <w:b/>
+          <w:bCs/>
+          <w:color w:val="000000"/>
+          <w:sz w:val="24"/>
+          <w:szCs w:val="24"/>
+          <w:shd w:fill="FFFF00" w:val="clear"/>
+        </w:rPr>
+        <w:t>apenas uma caracter</w:t>
+      </w:r>
+      <w:r>
+        <w:rPr>
+          <w:rFonts w:eastAsia="TimesNewRomanPS-BoldMT" w:cs="TimesNewRomanPS-BoldMT" w:ascii="TimesNewRomanPS-BoldMT" w:hAnsi="TimesNewRomanPS-BoldMT"/>
+          <w:b/>
+          <w:bCs/>
+          <w:color w:val="000000"/>
+          <w:kern w:val="2"/>
+          <w:sz w:val="24"/>
+          <w:szCs w:val="24"/>
+          <w:shd w:fill="FFFF00" w:val="clear"/>
+          <w:lang w:val="pt-PT" w:eastAsia="en-US" w:bidi="ar-SA"/>
+        </w:rPr>
+        <w:t>ística da dataset</w:t>
+      </w:r>
+      <w:r>
+        <w:rPr>
+          <w:rFonts w:eastAsia="TimesNewRomanPS-BoldMT" w:cs="TimesNewRomanPS-BoldMT" w:ascii="TimesNewRomanPS-BoldMT" w:hAnsi="TimesNewRomanPS-BoldMT"/>
+          <w:b/>
+          <w:bCs/>
+          <w:color w:val="000000"/>
+          <w:sz w:val="24"/>
+          <w:szCs w:val="24"/>
+          <w:shd w:fill="FFFF00" w:val="clear"/>
+        </w:rPr>
+        <w:t>.</w:t>
       </w:r>
     </w:p>
     <w:p>
@@ -3285,6 +3273,132 @@
         <w:rPr/>
       </w:pPr>
       <w:r>
+        <w:rPr>
+          <w:rFonts w:eastAsia="TimesNewRomanPS-BoldMT" w:cs="TimesNewRomanPS-BoldMT" w:ascii="TimesNewRomanPS-BoldMT" w:hAnsi="TimesNewRomanPS-BoldMT"/>
+          <w:b/>
+          <w:bCs/>
+          <w:color w:val="000000"/>
+          <w:sz w:val="24"/>
+          <w:szCs w:val="24"/>
+          <w:shd w:fill="FFFF00" w:val="clear"/>
+        </w:rPr>
+        <w:t xml:space="preserve">O método Naive Bayes estima probabilidades assumindo que existe independência condicional entre os atributos, </w:t>
+      </w:r>
+      <w:r>
+        <w:rPr>
+          <w:rFonts w:eastAsia="TimesNewRomanPS-BoldMT" w:cs="TimesNewRomanPS-BoldMT" w:ascii="TimesNewRomanPS-BoldMT" w:hAnsi="TimesNewRomanPS-BoldMT"/>
+          <w:b/>
+          <w:bCs/>
+          <w:color w:val="000000"/>
+          <w:sz w:val="24"/>
+          <w:szCs w:val="24"/>
+          <w:shd w:fill="FFFF00" w:val="clear"/>
+        </w:rPr>
+        <w:t xml:space="preserve">ou seja, tal como o nome diz, </w:t>
+      </w:r>
+      <w:r>
+        <w:rPr>
+          <w:rFonts w:eastAsia="TimesNewRomanPS-BoldMT" w:cs="TimesNewRomanPS-BoldMT" w:ascii="TimesNewRomanPS-BoldMT" w:hAnsi="TimesNewRomanPS-BoldMT"/>
+          <w:b/>
+          <w:bCs/>
+          <w:color w:val="000000"/>
+          <w:kern w:val="2"/>
+          <w:sz w:val="24"/>
+          <w:szCs w:val="24"/>
+          <w:shd w:fill="FFFF00" w:val="clear"/>
+          <w:lang w:val="pt-PT" w:eastAsia="en-US" w:bidi="ar-SA"/>
+        </w:rPr>
+        <w:t xml:space="preserve">é usado o teorema bayes para prever a classe: </w:t>
+      </w:r>
+    </w:p>
+    <w:p>
+      <w:pPr>
+        <w:pStyle w:val="Normal"/>
+        <w:widowControl/>
+        <w:spacing w:lineRule="auto" w:line="259" w:before="0" w:after="160"/>
+        <w:ind w:left="0" w:right="0" w:hanging="0"/>
+        <w:jc w:val="left"/>
+        <w:rPr>
+          <w:rFonts w:ascii="TimesNewRomanPS-BoldMT" w:hAnsi="TimesNewRomanPS-BoldMT" w:eastAsia="TimesNewRomanPS-BoldMT" w:cs="TimesNewRomanPS-BoldMT"/>
+          <w:b/>
+          <w:b/>
+          <w:bCs/>
+          <w:color w:val="000000"/>
+          <w:kern w:val="2"/>
+          <w:sz w:val="24"/>
+          <w:szCs w:val="24"/>
+          <w:shd w:fill="FFFF00" w:val="clear"/>
+          <w:lang w:val="pt-PT" w:eastAsia="en-US" w:bidi="ar-SA"/>
+        </w:rPr>
+      </w:pPr>
+      <w:r>
+        <w:rPr/>
+        <w:drawing>
+          <wp:anchor behindDoc="0" distT="0" distB="0" distL="0" distR="0" simplePos="0" locked="0" layoutInCell="0" allowOverlap="1" relativeHeight="7">
+            <wp:simplePos x="0" y="0"/>
+            <wp:positionH relativeFrom="column">
+              <wp:posOffset>1254760</wp:posOffset>
+            </wp:positionH>
+            <wp:positionV relativeFrom="paragraph">
+              <wp:posOffset>-95885</wp:posOffset>
+            </wp:positionV>
+            <wp:extent cx="2142490" cy="567690"/>
+            <wp:effectExtent l="0" t="0" r="0" b="0"/>
+            <wp:wrapSquare wrapText="largest"/>
+            <wp:docPr id="5" name="Image1" descr=""/>
+            <wp:cNvGraphicFramePr>
+              <a:graphicFrameLocks xmlns:a="http://schemas.openxmlformats.org/drawingml/2006/main" noChangeAspect="1"/>
+            </wp:cNvGraphicFramePr>
+            <a:graphic xmlns:a="http://schemas.openxmlformats.org/drawingml/2006/main">
+              <a:graphicData uri="http://schemas.openxmlformats.org/drawingml/2006/picture">
+                <pic:pic xmlns:pic="http://schemas.openxmlformats.org/drawingml/2006/picture">
+                  <pic:nvPicPr>
+                    <pic:cNvPr id="5" name="Image1" descr=""/>
+                    <pic:cNvPicPr>
+                      <a:picLocks noChangeAspect="1" noChangeArrowheads="1"/>
+                    </pic:cNvPicPr>
+                  </pic:nvPicPr>
+                  <pic:blipFill>
+                    <a:blip r:embed="rId6"/>
+                    <a:stretch>
+                      <a:fillRect/>
+                    </a:stretch>
+                  </pic:blipFill>
+                  <pic:spPr bwMode="auto">
+                    <a:xfrm>
+                      <a:off x="0" y="0"/>
+                      <a:ext cx="2142490" cy="567690"/>
+                    </a:xfrm>
+                    <a:prstGeom prst="rect">
+                      <a:avLst/>
+                    </a:prstGeom>
+                  </pic:spPr>
+                </pic:pic>
+              </a:graphicData>
+            </a:graphic>
+          </wp:anchor>
+        </w:drawing>
+      </w:r>
+    </w:p>
+    <w:p>
+      <w:pPr>
+        <w:pStyle w:val="Normal"/>
+        <w:widowControl/>
+        <w:spacing w:lineRule="auto" w:line="259" w:before="0" w:after="160"/>
+        <w:ind w:left="0" w:right="0" w:hanging="0"/>
+        <w:jc w:val="left"/>
+        <w:rPr>
+          <w:rFonts w:ascii="TimesNewRomanPS-BoldMT" w:hAnsi="TimesNewRomanPS-BoldMT" w:eastAsia="TimesNewRomanPS-BoldMT" w:cs="TimesNewRomanPS-BoldMT"/>
+          <w:b/>
+          <w:b/>
+          <w:bCs/>
+          <w:color w:val="000000"/>
+          <w:sz w:val="24"/>
+          <w:szCs w:val="24"/>
+          <w:shd w:fill="FFFF00" w:val="clear"/>
+        </w:rPr>
+      </w:pPr>
+      <w:r>
         <w:rPr/>
       </w:r>
     </w:p>
@@ -3303,11 +3417,49 @@
           <w:b/>
           <w:bCs/>
           <w:color w:val="000000"/>
-          <w:sz w:val="28"/>
-          <w:szCs w:val="28"/>
-          <w:shd w:fill="FFFF00" w:val="clear"/>
-        </w:rPr>
-        <w:t>3. Conclusão</w:t>
+          <w:sz w:val="24"/>
+          <w:szCs w:val="24"/>
+          <w:shd w:fill="FFFF00" w:val="clear"/>
+        </w:rPr>
+        <w:t xml:space="preserve">Ele é mais eficiente e robusto em grandes conjuntos de dados, </w:t>
+      </w:r>
+      <w:r>
+        <w:rPr>
+          <w:rFonts w:eastAsia="TimesNewRomanPS-BoldMT" w:cs="TimesNewRomanPS-BoldMT" w:ascii="TimesNewRomanPS-BoldMT" w:hAnsi="TimesNewRomanPS-BoldMT"/>
+          <w:b/>
+          <w:bCs/>
+          <w:color w:val="000000"/>
+          <w:sz w:val="24"/>
+          <w:szCs w:val="24"/>
+          <w:shd w:fill="FFFF00" w:val="clear"/>
+        </w:rPr>
+        <w:t xml:space="preserve">mas normalmente o seu desempenho </w:t>
+      </w:r>
+      <w:r>
+        <w:rPr>
+          <w:rFonts w:eastAsia="TimesNewRomanPS-BoldMT" w:cs="TimesNewRomanPS-BoldMT" w:ascii="TimesNewRomanPS-BoldMT" w:hAnsi="TimesNewRomanPS-BoldMT"/>
+          <w:b/>
+          <w:bCs/>
+          <w:color w:val="000000"/>
+          <w:kern w:val="2"/>
+          <w:sz w:val="24"/>
+          <w:szCs w:val="24"/>
+          <w:shd w:fill="FFFF00" w:val="clear"/>
+          <w:lang w:val="pt-PT" w:eastAsia="en-US" w:bidi="ar-SA"/>
+        </w:rPr>
+        <w:t>é pior do que outros classificadores mais avançados, especialmente quando a dataset não é suficiente grande ou bem representada em dados</w:t>
+      </w:r>
+      <w:r>
+        <w:rPr>
+          <w:rFonts w:eastAsia="TimesNewRomanPS-BoldMT" w:cs="TimesNewRomanPS-BoldMT" w:ascii="TimesNewRomanPS-BoldMT" w:hAnsi="TimesNewRomanPS-BoldMT"/>
+          <w:b/>
+          <w:bCs/>
+          <w:color w:val="000000"/>
+          <w:sz w:val="24"/>
+          <w:szCs w:val="24"/>
+          <w:shd w:fill="FFFF00" w:val="clear"/>
+        </w:rPr>
+        <w:t xml:space="preserve">. </w:t>
       </w:r>
     </w:p>
     <w:p>
@@ -3317,6 +3469,91 @@
         <w:spacing w:lineRule="auto" w:line="259" w:before="0" w:after="160"/>
         <w:ind w:left="0" w:right="0" w:hanging="0"/>
         <w:jc w:val="left"/>
+        <w:rPr/>
+      </w:pPr>
+      <w:r>
+        <w:rPr>
+          <w:rFonts w:eastAsia="TimesNewRomanPS-BoldMT" w:cs="TimesNewRomanPS-BoldMT" w:ascii="TimesNewRomanPS-BoldMT" w:hAnsi="TimesNewRomanPS-BoldMT"/>
+          <w:b/>
+          <w:bCs/>
+          <w:color w:val="000000"/>
+          <w:sz w:val="24"/>
+          <w:szCs w:val="24"/>
+          <w:shd w:fill="FFFF00" w:val="clear"/>
+        </w:rPr>
+        <w:t xml:space="preserve">O classificador induction tree </w:t>
+      </w:r>
+      <w:r>
+        <w:rPr>
+          <w:rFonts w:eastAsia="TimesNewRomanPS-BoldMT" w:cs="TimesNewRomanPS-BoldMT" w:ascii="TimesNewRomanPS-BoldMT" w:hAnsi="TimesNewRomanPS-BoldMT"/>
+          <w:b/>
+          <w:bCs/>
+          <w:color w:val="000000"/>
+          <w:kern w:val="2"/>
+          <w:sz w:val="24"/>
+          <w:szCs w:val="24"/>
+          <w:shd w:fill="FFFF00" w:val="clear"/>
+          <w:lang w:val="pt-PT" w:eastAsia="en-US" w:bidi="ar-SA"/>
+        </w:rPr>
+        <w:t xml:space="preserve">é um modelo mais avançado do que os outros dois modelos referidos, sendo o que usa um modelo do tipo árvore de grafos. O modelo começa pelo um nó de raiz que contém a dataset toda, em seguida é dividida em </w:t>
+      </w:r>
+      <w:r>
+        <w:rPr>
+          <w:rFonts w:eastAsia="TimesNewRomanPS-BoldMT" w:cs="TimesNewRomanPS-BoldMT" w:ascii="TimesNewRomanPS-BoldMT" w:hAnsi="TimesNewRomanPS-BoldMT"/>
+          <w:b/>
+          <w:bCs/>
+          <w:color w:val="000000"/>
+          <w:kern w:val="2"/>
+          <w:sz w:val="24"/>
+          <w:szCs w:val="24"/>
+          <w:shd w:fill="FFFF00" w:val="clear"/>
+          <w:lang w:val="pt-PT" w:eastAsia="en-US" w:bidi="ar-SA"/>
+        </w:rPr>
+        <w:t>dois nós de subdados da dataset. Isto é feito recursivamente para cada divisão de nós de dados. A divisão de nós é terminado quando não existe valor para a previsão de classes. Induction tree tem tendência a overfitting, para não acontecer tal coisa, é necessário remover nós que não têm valor para previsão ou até adicionar um valor máximo de profundidade de divisão de nós. No final, com esta complexidade induction tree é o melhor modelo para classificação entre os modelos referidos, mas pelo um preço de um custo computacional.</w:t>
+      </w:r>
+    </w:p>
+    <w:p>
+      <w:pPr>
+        <w:pStyle w:val="Normal"/>
+        <w:widowControl/>
+        <w:spacing w:lineRule="auto" w:line="259" w:before="0" w:after="160"/>
+        <w:ind w:left="0" w:right="0" w:hanging="0"/>
+        <w:jc w:val="left"/>
+        <w:rPr/>
+      </w:pPr>
+      <w:r>
+        <w:rPr/>
+      </w:r>
+    </w:p>
+    <w:p>
+      <w:pPr>
+        <w:pStyle w:val="Normal"/>
+        <w:widowControl/>
+        <w:spacing w:lineRule="auto" w:line="259" w:before="0" w:after="160"/>
+        <w:ind w:left="0" w:right="0" w:hanging="0"/>
+        <w:jc w:val="left"/>
+        <w:rPr/>
+      </w:pPr>
+      <w:r>
+        <w:rPr>
+          <w:rFonts w:eastAsia="TimesNewRomanPS-BoldMT" w:cs="TimesNewRomanPS-BoldMT" w:ascii="TimesNewRomanPS-BoldMT" w:hAnsi="TimesNewRomanPS-BoldMT"/>
+          <w:b/>
+          <w:bCs/>
+          <w:color w:val="000000"/>
+          <w:sz w:val="28"/>
+          <w:szCs w:val="28"/>
+          <w:shd w:fill="FFFF00" w:val="clear"/>
+        </w:rPr>
+        <w:t>3. Conclusão</w:t>
+      </w:r>
+    </w:p>
+    <w:p>
+      <w:pPr>
+        <w:pStyle w:val="Normal"/>
+        <w:widowControl/>
+        <w:spacing w:lineRule="auto" w:line="259" w:before="0" w:after="160"/>
+        <w:ind w:left="0" w:right="0" w:hanging="0"/>
+        <w:jc w:val="left"/>
         <w:rPr>
           <w:rFonts w:ascii="Times New Roman" w:hAnsi="Times New Roman" w:cs="Times New Roman"/>
           <w:b/>
@@ -3366,11 +3603,98 @@
         <w:rPr/>
       </w:r>
     </w:p>
+    <w:p>
+      <w:pPr>
+        <w:pStyle w:val="Normal"/>
+        <w:spacing w:before="0" w:after="160"/>
+        <w:rPr>
+          <w:rFonts w:ascii="Times New Roman" w:hAnsi="Times New Roman" w:cs="Times New Roman"/>
+        </w:rPr>
+      </w:pPr>
+      <w:r>
+        <w:rPr/>
+      </w:r>
+    </w:p>
+    <w:p>
+      <w:pPr>
+        <w:pStyle w:val="Normal"/>
+        <w:spacing w:before="0" w:after="160"/>
+        <w:rPr>
+          <w:rFonts w:ascii="Times New Roman" w:hAnsi="Times New Roman" w:cs="Times New Roman"/>
+        </w:rPr>
+      </w:pPr>
+      <w:r>
+        <w:rPr/>
+      </w:r>
+    </w:p>
+    <w:p>
+      <w:pPr>
+        <w:pStyle w:val="Normal"/>
+        <w:spacing w:before="0" w:after="160"/>
+        <w:rPr>
+          <w:rFonts w:ascii="Times New Roman" w:hAnsi="Times New Roman" w:cs="Times New Roman"/>
+        </w:rPr>
+      </w:pPr>
+      <w:r>
+        <w:rPr/>
+      </w:r>
+    </w:p>
+    <w:p>
+      <w:pPr>
+        <w:pStyle w:val="Normal"/>
+        <w:spacing w:before="0" w:after="160"/>
+        <w:rPr>
+          <w:rFonts w:ascii="Times New Roman" w:hAnsi="Times New Roman" w:cs="Times New Roman"/>
+        </w:rPr>
+      </w:pPr>
+      <w:r>
+        <w:rPr/>
+      </w:r>
+    </w:p>
+    <w:p>
+      <w:pPr>
+        <w:pStyle w:val="Normal"/>
+        <w:spacing w:before="0" w:after="160"/>
+        <w:rPr>
+          <w:rFonts w:ascii="Times New Roman" w:hAnsi="Times New Roman" w:cs="Times New Roman"/>
+        </w:rPr>
+      </w:pPr>
+      <w:r>
+        <w:rPr/>
+      </w:r>
+    </w:p>
+    <w:p>
+      <w:pPr>
+        <w:pStyle w:val="Normal"/>
+        <w:spacing w:before="0" w:after="160"/>
+        <w:rPr>
+          <w:rFonts w:ascii="Times New Roman" w:hAnsi="Times New Roman" w:cs="Times New Roman"/>
+        </w:rPr>
+      </w:pPr>
+      <w:r>
+        <w:rPr/>
+        <w:t>Refer</w:t>
+      </w:r>
+      <w:r>
+        <w:rPr>
+          <w:rFonts w:eastAsia="Aptos" w:cs="" w:cstheme="minorBidi" w:eastAsiaTheme="minorHAnsi"/>
+          <w:color w:val="auto"/>
+          <w:kern w:val="2"/>
+          <w:sz w:val="22"/>
+          <w:szCs w:val="22"/>
+          <w:lang w:val="pt-PT" w:eastAsia="en-US" w:bidi="ar-SA"/>
+          <w14:ligatures w14:val="standardContextual"/>
+        </w:rPr>
+        <w:t>ências:</w:t>
+        <w:br/>
+        <w:t>https://deepai.org/machine-learning-glossary-and-terms/tree-induction-algorithm</w:t>
+      </w:r>
+    </w:p>
     <w:sectPr>
-      <w:headerReference w:type="default" r:id="rId6"/>
-      <w:headerReference w:type="first" r:id="rId7"/>
-      <w:footerReference w:type="default" r:id="rId8"/>
-      <w:footerReference w:type="first" r:id="rId9"/>
+      <w:headerReference w:type="default" r:id="rId7"/>
+      <w:headerReference w:type="first" r:id="rId8"/>
+      <w:footerReference w:type="default" r:id="rId9"/>
+      <w:footerReference w:type="first" r:id="rId10"/>
       <w:type w:val="nextPage"/>
       <w:pgSz w:w="11906" w:h="16838"/>
       <w:pgMar w:left="1701" w:right="1701" w:gutter="0" w:header="708" w:top="1417" w:footer="708" w:bottom="1417"/>
@@ -3392,7 +3716,7 @@
         <w:docPartGallery w:val="Page Numbers (Bottom of Page)"/>
         <w:docPartUnique w:val="true"/>
       </w:docPartObj>
-      <w:id w:val="863171528"/>
+      <w:id w:val="128029506"/>
     </w:sdtPr>
     <w:sdtContent>
       <w:p>
@@ -3511,19 +3835,19 @@
           <wp:positionV relativeFrom="paragraph">
             <wp:posOffset>-60960</wp:posOffset>
           </wp:positionV>
-          <wp:extent cx="998220" cy="231775"/>
+          <wp:extent cx="1398270" cy="324485"/>
           <wp:effectExtent l="0" t="0" r="0" b="0"/>
           <wp:wrapTight wrapText="bothSides">
             <wp:wrapPolygon edited="0">
-              <wp:start x="-14" y="0"/>
-              <wp:lineTo x="-14" y="19517"/>
-              <wp:lineTo x="21015" y="19517"/>
-              <wp:lineTo x="21015" y="15964"/>
-              <wp:lineTo x="18125" y="0"/>
-              <wp:lineTo x="-14" y="0"/>
+              <wp:start x="-23" y="0"/>
+              <wp:lineTo x="-23" y="19504"/>
+              <wp:lineTo x="21009" y="19504"/>
+              <wp:lineTo x="21009" y="15950"/>
+              <wp:lineTo x="18115" y="0"/>
+              <wp:lineTo x="-23" y="0"/>
             </wp:wrapPolygon>
           </wp:wrapTight>
-          <wp:docPr id="5" name="Image3" descr="Uma imagem com Tipo de letra, Gráficos, logótipo, design&#10;&#10;Os conteúdos gerados por IA podem estar incorretos."/>
+          <wp:docPr id="6" name="Image3" descr="Uma imagem com Tipo de letra, Gráficos, logótipo, design&#10;&#10;Os conteúdos gerados por IA podem estar incorretos."/>
           <wp:cNvGraphicFramePr>
             <a:graphicFrameLocks xmlns:a="http://schemas.openxmlformats.org/drawingml/2006/main" noChangeAspect="1"/>
           </wp:cNvGraphicFramePr>
@@ -3531,7 +3855,7 @@
             <a:graphicData uri="http://schemas.openxmlformats.org/drawingml/2006/picture">
               <pic:pic xmlns:pic="http://schemas.openxmlformats.org/drawingml/2006/picture">
                 <pic:nvPicPr>
-                  <pic:cNvPr id="5" name="Image3" descr="Uma imagem com Tipo de letra, Gráficos, logótipo, design&#10;&#10;Os conteúdos gerados por IA podem estar incorretos."/>
+                  <pic:cNvPr id="6" name="Image3" descr="Uma imagem com Tipo de letra, Gráficos, logótipo, design&#10;&#10;Os conteúdos gerados por IA podem estar incorretos."/>
                   <pic:cNvPicPr>
                     <a:picLocks noChangeAspect="1" noChangeArrowheads="1"/>
                   </pic:cNvPicPr>
@@ -3546,7 +3870,7 @@
                 <pic:spPr bwMode="auto">
                   <a:xfrm>
                     <a:off x="0" y="0"/>
-                    <a:ext cx="998220" cy="231775"/>
+                    <a:ext cx="1398270" cy="324485"/>
                   </a:xfrm>
                   <a:prstGeom prst="rect">
                     <a:avLst/>

</xml_diff>

<commit_message>
docs(report): Added evaluation metrics onto to the report
</commit_message>
<xml_diff>
--- a/PROJECT_A/report_projeto_a.docx
+++ b/PROJECT_A/report_projeto_a.docx
@@ -616,6 +616,33 @@
         </w:rPr>
         <w:tab/>
         <w:t>2.6. Algoritmo ID3 e Naïve Bayes</w:t>
+      </w:r>
+    </w:p>
+    <w:p>
+      <w:pPr>
+        <w:pStyle w:val="Normal"/>
+        <w:rPr>
+          <w:rFonts w:ascii="Times New Roman" w:hAnsi="Times New Roman" w:cs="Times New Roman"/>
+        </w:rPr>
+      </w:pPr>
+      <w:r>
+        <w:rPr>
+          <w:rFonts w:cs="Times New Roman" w:ascii="Times New Roman" w:hAnsi="Times New Roman"/>
+        </w:rPr>
+        <w:tab/>
+        <w:t>2.7. Avaliaç</w:t>
+      </w:r>
+      <w:r>
+        <w:rPr>
+          <w:rFonts w:eastAsia="Aptos" w:cs="Times New Roman" w:ascii="Times New Roman" w:hAnsi="Times New Roman" w:eastAsiaTheme="minorHAnsi"/>
+          <w:color w:val="auto"/>
+          <w:kern w:val="2"/>
+          <w:sz w:val="22"/>
+          <w:szCs w:val="22"/>
+          <w:lang w:val="pt-PT" w:eastAsia="en-US" w:bidi="ar-SA"/>
+          <w14:ligatures w14:val="standardContextual"/>
+        </w:rPr>
+        <w:t>ões métricas</w:t>
       </w:r>
     </w:p>
     <w:p>
@@ -1249,11 +1276,11 @@
             <wp:effectExtent l="0" t="0" r="0" b="0"/>
             <wp:wrapTight wrapText="bothSides">
               <wp:wrapPolygon edited="0">
-                <wp:start x="-16" y="0"/>
-                <wp:lineTo x="-16" y="21260"/>
-                <wp:lineTo x="21383" y="21260"/>
-                <wp:lineTo x="21383" y="0"/>
-                <wp:lineTo x="-16" y="0"/>
+                <wp:start x="-23" y="0"/>
+                <wp:lineTo x="-23" y="21255"/>
+                <wp:lineTo x="21377" y="21255"/>
+                <wp:lineTo x="21377" y="0"/>
+                <wp:lineTo x="-23" y="0"/>
               </wp:wrapPolygon>
             </wp:wrapTight>
             <wp:docPr id="1" name="Imagem 2" descr="Uma imagem com texto, captura de ecrã, número, Tipo de letra&#10;&#10;Os conteúdos gerados por IA podem estar incorretos."/>
@@ -1575,11 +1602,11 @@
             <wp:effectExtent l="0" t="0" r="0" b="0"/>
             <wp:wrapTight wrapText="bothSides">
               <wp:wrapPolygon edited="0">
-                <wp:start x="-15" y="0"/>
-                <wp:lineTo x="-15" y="21451"/>
-                <wp:lineTo x="21504" y="21451"/>
-                <wp:lineTo x="21504" y="0"/>
-                <wp:lineTo x="-15" y="0"/>
+                <wp:start x="-21" y="0"/>
+                <wp:lineTo x="-21" y="21447"/>
+                <wp:lineTo x="21498" y="21447"/>
+                <wp:lineTo x="21498" y="0"/>
+                <wp:lineTo x="-21" y="0"/>
               </wp:wrapPolygon>
             </wp:wrapTight>
             <wp:docPr id="2" name="Imagem 3" descr="Uma imagem com texto, captura de ecrã, número, diagrama&#10;&#10;Os conteúdos gerados por IA podem estar incorretos."/>
@@ -1940,11 +1967,11 @@
             <wp:effectExtent l="0" t="0" r="0" b="0"/>
             <wp:wrapTight wrapText="bothSides">
               <wp:wrapPolygon edited="0">
-                <wp:start x="-15" y="0"/>
-                <wp:lineTo x="-15" y="21302"/>
-                <wp:lineTo x="21494" y="21302"/>
-                <wp:lineTo x="21494" y="0"/>
-                <wp:lineTo x="-15" y="0"/>
+                <wp:start x="-21" y="0"/>
+                <wp:lineTo x="-21" y="21294"/>
+                <wp:lineTo x="21488" y="21294"/>
+                <wp:lineTo x="21488" y="0"/>
+                <wp:lineTo x="-21" y="0"/>
               </wp:wrapPolygon>
             </wp:wrapTight>
             <wp:docPr id="3" name="Imagem 1" descr="Uma imagem com texto, Tipo de letra, número, file&#10;&#10;Os conteúdos gerados por IA podem estar incorretos."/>
@@ -2240,11 +2267,11 @@
             <wp:effectExtent l="0" t="0" r="0" b="0"/>
             <wp:wrapTight wrapText="bothSides">
               <wp:wrapPolygon edited="0">
-                <wp:start x="-19" y="0"/>
-                <wp:lineTo x="-19" y="21376"/>
-                <wp:lineTo x="21407" y="21376"/>
-                <wp:lineTo x="21407" y="0"/>
-                <wp:lineTo x="-19" y="0"/>
+                <wp:start x="-26" y="0"/>
+                <wp:lineTo x="-26" y="21370"/>
+                <wp:lineTo x="21399" y="21370"/>
+                <wp:lineTo x="21399" y="0"/>
+                <wp:lineTo x="-26" y="0"/>
               </wp:wrapPolygon>
             </wp:wrapTight>
             <wp:docPr id="4" name="Image2" descr="Uma imagem com texto, captura de ecrã, Tipo de letra, número&#10;&#10;Os conteúdos gerados por IA podem estar incorretos."/>
@@ -3150,91 +3177,7 @@
           <w:szCs w:val="24"/>
           <w:shd w:fill="FFFF00" w:val="clear"/>
         </w:rPr>
-        <w:t xml:space="preserve">Os classificadores de </w:t>
-      </w:r>
-      <w:r>
-        <w:rPr>
-          <w:rFonts w:eastAsia="TimesNewRomanPS-BoldMT" w:cs="TimesNewRomanPS-BoldMT" w:ascii="TimesNewRomanPS-BoldMT" w:hAnsi="TimesNewRomanPS-BoldMT"/>
-          <w:b/>
-          <w:bCs/>
-          <w:color w:val="000000"/>
-          <w:sz w:val="24"/>
-          <w:szCs w:val="24"/>
-          <w:shd w:fill="FFFF00" w:val="clear"/>
-        </w:rPr>
-        <w:t xml:space="preserve">induction tree </w:t>
-      </w:r>
-      <w:r>
-        <w:rPr>
-          <w:rFonts w:eastAsia="TimesNewRomanPS-BoldMT" w:cs="TimesNewRomanPS-BoldMT" w:ascii="TimesNewRomanPS-BoldMT" w:hAnsi="TimesNewRomanPS-BoldMT"/>
-          <w:b/>
-          <w:bCs/>
-          <w:color w:val="000000"/>
-          <w:sz w:val="24"/>
-          <w:szCs w:val="24"/>
-          <w:shd w:fill="FFFF00" w:val="clear"/>
-        </w:rPr>
-        <w:t xml:space="preserve">e </w:t>
-      </w:r>
-      <w:r>
-        <w:rPr>
-          <w:rFonts w:eastAsia="TimesNewRomanPS-BoldMT" w:cs="TimesNewRomanPS-BoldMT" w:ascii="TimesNewRomanPS-BoldMT" w:hAnsi="TimesNewRomanPS-BoldMT"/>
-          <w:b/>
-          <w:bCs/>
-          <w:color w:val="000000"/>
-          <w:sz w:val="24"/>
-          <w:szCs w:val="24"/>
-          <w:shd w:fill="FFFF00" w:val="clear"/>
-        </w:rPr>
-        <w:t>naive bayes</w:t>
-      </w:r>
-      <w:r>
-        <w:rPr>
-          <w:rFonts w:eastAsia="TimesNewRomanPS-BoldMT" w:cs="TimesNewRomanPS-BoldMT" w:ascii="TimesNewRomanPS-BoldMT" w:hAnsi="TimesNewRomanPS-BoldMT"/>
-          <w:b/>
-          <w:bCs/>
-          <w:color w:val="000000"/>
-          <w:sz w:val="24"/>
-          <w:szCs w:val="24"/>
-          <w:shd w:fill="FFFF00" w:val="clear"/>
-        </w:rPr>
-        <w:t xml:space="preserve"> são modelos que apresentam melhor precisão em comparação com </w:t>
-      </w:r>
-      <w:r>
-        <w:rPr>
-          <w:rFonts w:eastAsia="TimesNewRomanPS-BoldMT" w:cs="TimesNewRomanPS-BoldMT" w:ascii="TimesNewRomanPS-BoldMT" w:hAnsi="TimesNewRomanPS-BoldMT"/>
-          <w:b/>
-          <w:bCs/>
-          <w:color w:val="000000"/>
-          <w:sz w:val="24"/>
-          <w:szCs w:val="24"/>
-          <w:shd w:fill="FFFF00" w:val="clear"/>
-        </w:rPr>
-        <w:t xml:space="preserve">o algoritmo 1 Rule </w:t>
-      </w:r>
-      <w:r>
-        <w:rPr>
-          <w:rFonts w:eastAsia="TimesNewRomanPS-BoldMT" w:cs="TimesNewRomanPS-BoldMT" w:ascii="TimesNewRomanPS-BoldMT" w:hAnsi="TimesNewRomanPS-BoldMT"/>
-          <w:b/>
-          <w:bCs/>
-          <w:color w:val="000000"/>
-          <w:sz w:val="24"/>
-          <w:szCs w:val="24"/>
-          <w:shd w:fill="FFFF00" w:val="clear"/>
-        </w:rPr>
-        <w:t xml:space="preserve">que utiliza </w:t>
-      </w:r>
-      <w:r>
-        <w:rPr>
-          <w:rFonts w:eastAsia="TimesNewRomanPS-BoldMT" w:cs="TimesNewRomanPS-BoldMT" w:ascii="TimesNewRomanPS-BoldMT" w:hAnsi="TimesNewRomanPS-BoldMT"/>
-          <w:b/>
-          <w:bCs/>
-          <w:color w:val="000000"/>
-          <w:sz w:val="24"/>
-          <w:szCs w:val="24"/>
-          <w:shd w:fill="FFFF00" w:val="clear"/>
-        </w:rPr>
-        <w:t>apenas uma caracter</w:t>
+        <w:t>Os classificadores de induction tree e naive bayes são modelos que apresentam melhor precisão em comparação com o algoritmo 1 Rule que utiliza apenas uma caracter</w:t>
       </w:r>
       <w:r>
         <w:rPr>
@@ -3282,19 +3225,7 @@
           <w:szCs w:val="24"/>
           <w:shd w:fill="FFFF00" w:val="clear"/>
         </w:rPr>
-        <w:t xml:space="preserve">O método Naive Bayes estima probabilidades assumindo que existe independência condicional entre os atributos, </w:t>
-      </w:r>
-      <w:r>
-        <w:rPr>
-          <w:rFonts w:eastAsia="TimesNewRomanPS-BoldMT" w:cs="TimesNewRomanPS-BoldMT" w:ascii="TimesNewRomanPS-BoldMT" w:hAnsi="TimesNewRomanPS-BoldMT"/>
-          <w:b/>
-          <w:bCs/>
-          <w:color w:val="000000"/>
-          <w:sz w:val="24"/>
-          <w:szCs w:val="24"/>
-          <w:shd w:fill="FFFF00" w:val="clear"/>
-        </w:rPr>
-        <w:t xml:space="preserve">ou seja, tal como o nome diz, </w:t>
+        <w:t xml:space="preserve">O método Naive Bayes estima probabilidades assumindo que existe independência condicional entre os atributos, ou seja, tal como o nome diz, </w:t>
       </w:r>
       <w:r>
         <w:rPr>
@@ -3332,7 +3263,17 @@
         </w:rPr>
       </w:pPr>
       <w:r>
-        <w:rPr/>
+        <w:rPr>
+          <w:rFonts w:eastAsia="TimesNewRomanPS-BoldMT" w:cs="TimesNewRomanPS-BoldMT" w:ascii="TimesNewRomanPS-BoldMT" w:hAnsi="TimesNewRomanPS-BoldMT"/>
+          <w:b/>
+          <w:bCs/>
+          <w:color w:val="000000"/>
+          <w:kern w:val="2"/>
+          <w:sz w:val="24"/>
+          <w:szCs w:val="24"/>
+          <w:shd w:fill="FFFF00" w:val="clear"/>
+          <w:lang w:val="pt-PT" w:eastAsia="en-US" w:bidi="ar-SA"/>
+        </w:rPr>
         <w:drawing>
           <wp:anchor behindDoc="0" distT="0" distB="0" distL="0" distR="0" simplePos="0" locked="0" layoutInCell="0" allowOverlap="1" relativeHeight="7">
             <wp:simplePos x="0" y="0"/>
@@ -3399,7 +3340,150 @@
         </w:rPr>
       </w:pPr>
       <w:r>
-        <w:rPr/>
+        <w:rPr>
+          <w:rFonts w:eastAsia="TimesNewRomanPS-BoldMT" w:cs="TimesNewRomanPS-BoldMT" w:ascii="TimesNewRomanPS-BoldMT" w:hAnsi="TimesNewRomanPS-BoldMT"/>
+          <w:b/>
+          <w:bCs/>
+          <w:color w:val="000000"/>
+          <w:sz w:val="24"/>
+          <w:szCs w:val="24"/>
+          <w:shd w:fill="FFFF00" w:val="clear"/>
+        </w:rPr>
+      </w:r>
+    </w:p>
+    <w:p>
+      <w:pPr>
+        <w:pStyle w:val="Normal"/>
+        <w:widowControl/>
+        <w:spacing w:lineRule="auto" w:line="259" w:before="0" w:after="160"/>
+        <w:ind w:left="0" w:right="0" w:hanging="0"/>
+        <w:jc w:val="left"/>
+        <w:rPr>
+          <w:rFonts w:ascii="TimesNewRomanPS-BoldMT" w:hAnsi="TimesNewRomanPS-BoldMT" w:eastAsia="TimesNewRomanPS-BoldMT" w:cs="TimesNewRomanPS-BoldMT"/>
+          <w:b/>
+          <w:b/>
+          <w:bCs/>
+          <w:color w:val="000000"/>
+          <w:sz w:val="24"/>
+          <w:szCs w:val="24"/>
+          <w:shd w:fill="FFFF00" w:val="clear"/>
+        </w:rPr>
+      </w:pPr>
+      <w:r>
+        <w:rPr>
+          <w:rFonts w:eastAsia="TimesNewRomanPS-BoldMT" w:cs="TimesNewRomanPS-BoldMT" w:ascii="TimesNewRomanPS-BoldMT" w:hAnsi="TimesNewRomanPS-BoldMT"/>
+          <w:b/>
+          <w:bCs/>
+          <w:color w:val="000000"/>
+          <w:sz w:val="24"/>
+          <w:szCs w:val="24"/>
+          <w:shd w:fill="FFFF00" w:val="clear"/>
+        </w:rPr>
+        <w:drawing>
+          <wp:anchor behindDoc="0" distT="0" distB="0" distL="0" distR="0" simplePos="0" locked="0" layoutInCell="0" allowOverlap="1" relativeHeight="8">
+            <wp:simplePos x="0" y="0"/>
+            <wp:positionH relativeFrom="column">
+              <wp:posOffset>126365</wp:posOffset>
+            </wp:positionH>
+            <wp:positionV relativeFrom="paragraph">
+              <wp:posOffset>635</wp:posOffset>
+            </wp:positionV>
+            <wp:extent cx="4886325" cy="752475"/>
+            <wp:effectExtent l="0" t="0" r="0" b="0"/>
+            <wp:wrapSquare wrapText="largest"/>
+            <wp:docPr id="6" name="Image4" descr=""/>
+            <wp:cNvGraphicFramePr>
+              <a:graphicFrameLocks xmlns:a="http://schemas.openxmlformats.org/drawingml/2006/main" noChangeAspect="1"/>
+            </wp:cNvGraphicFramePr>
+            <a:graphic xmlns:a="http://schemas.openxmlformats.org/drawingml/2006/main">
+              <a:graphicData uri="http://schemas.openxmlformats.org/drawingml/2006/picture">
+                <pic:pic xmlns:pic="http://schemas.openxmlformats.org/drawingml/2006/picture">
+                  <pic:nvPicPr>
+                    <pic:cNvPr id="6" name="Image4" descr=""/>
+                    <pic:cNvPicPr>
+                      <a:picLocks noChangeAspect="1" noChangeArrowheads="1"/>
+                    </pic:cNvPicPr>
+                  </pic:nvPicPr>
+                  <pic:blipFill>
+                    <a:blip r:embed="rId7"/>
+                    <a:stretch>
+                      <a:fillRect/>
+                    </a:stretch>
+                  </pic:blipFill>
+                  <pic:spPr bwMode="auto">
+                    <a:xfrm>
+                      <a:off x="0" y="0"/>
+                      <a:ext cx="4886325" cy="752475"/>
+                    </a:xfrm>
+                    <a:prstGeom prst="rect">
+                      <a:avLst/>
+                    </a:prstGeom>
+                  </pic:spPr>
+                </pic:pic>
+              </a:graphicData>
+            </a:graphic>
+          </wp:anchor>
+        </w:drawing>
+      </w:r>
+    </w:p>
+    <w:p>
+      <w:pPr>
+        <w:pStyle w:val="Normal"/>
+        <w:widowControl/>
+        <w:spacing w:lineRule="auto" w:line="259" w:before="0" w:after="160"/>
+        <w:ind w:left="0" w:right="0" w:hanging="0"/>
+        <w:jc w:val="left"/>
+        <w:rPr>
+          <w:rFonts w:ascii="TimesNewRomanPS-BoldMT" w:hAnsi="TimesNewRomanPS-BoldMT" w:eastAsia="TimesNewRomanPS-BoldMT" w:cs="TimesNewRomanPS-BoldMT"/>
+          <w:b/>
+          <w:b/>
+          <w:bCs/>
+          <w:color w:val="000000"/>
+          <w:sz w:val="24"/>
+          <w:szCs w:val="24"/>
+          <w:shd w:fill="FFFF00" w:val="clear"/>
+        </w:rPr>
+      </w:pPr>
+      <w:r>
+        <w:rPr>
+          <w:rFonts w:eastAsia="TimesNewRomanPS-BoldMT" w:cs="TimesNewRomanPS-BoldMT" w:ascii="TimesNewRomanPS-BoldMT" w:hAnsi="TimesNewRomanPS-BoldMT"/>
+          <w:b/>
+          <w:bCs/>
+          <w:color w:val="000000"/>
+          <w:sz w:val="24"/>
+          <w:szCs w:val="24"/>
+          <w:shd w:fill="FFFF00" w:val="clear"/>
+        </w:rPr>
+      </w:r>
+    </w:p>
+    <w:p>
+      <w:pPr>
+        <w:pStyle w:val="Normal"/>
+        <w:widowControl/>
+        <w:spacing w:lineRule="auto" w:line="259" w:before="0" w:after="160"/>
+        <w:ind w:left="0" w:right="0" w:hanging="0"/>
+        <w:jc w:val="left"/>
+        <w:rPr>
+          <w:rFonts w:ascii="TimesNewRomanPS-BoldMT" w:hAnsi="TimesNewRomanPS-BoldMT" w:eastAsia="TimesNewRomanPS-BoldMT" w:cs="TimesNewRomanPS-BoldMT"/>
+          <w:b/>
+          <w:b/>
+          <w:bCs/>
+          <w:color w:val="000000"/>
+          <w:sz w:val="24"/>
+          <w:szCs w:val="24"/>
+          <w:shd w:fill="FFFF00" w:val="clear"/>
+        </w:rPr>
+      </w:pPr>
+      <w:r>
+        <w:rPr>
+          <w:rFonts w:eastAsia="TimesNewRomanPS-BoldMT" w:cs="TimesNewRomanPS-BoldMT" w:ascii="TimesNewRomanPS-BoldMT" w:hAnsi="TimesNewRomanPS-BoldMT"/>
+          <w:b/>
+          <w:bCs/>
+          <w:color w:val="000000"/>
+          <w:sz w:val="24"/>
+          <w:szCs w:val="24"/>
+          <w:shd w:fill="FFFF00" w:val="clear"/>
+        </w:rPr>
       </w:r>
     </w:p>
     <w:p>
@@ -3421,7 +3505,7 @@
           <w:szCs w:val="24"/>
           <w:shd w:fill="FFFF00" w:val="clear"/>
         </w:rPr>
-        <w:t xml:space="preserve">Ele é mais eficiente e robusto em grandes conjuntos de dados, </w:t>
+        <w:t xml:space="preserve">Ele é mais eficiente e robusto em </w:t>
       </w:r>
       <w:r>
         <w:rPr>
@@ -3433,7 +3517,7 @@
           <w:szCs w:val="24"/>
           <w:shd w:fill="FFFF00" w:val="clear"/>
         </w:rPr>
-        <w:t xml:space="preserve">mas normalmente o seu desempenho </w:t>
+        <w:t>pequenos</w:t>
       </w:r>
       <w:r>
         <w:rPr>
@@ -3441,13 +3525,67 @@
           <w:b/>
           <w:bCs/>
           <w:color w:val="000000"/>
+          <w:sz w:val="24"/>
+          <w:szCs w:val="24"/>
+          <w:shd w:fill="FFFF00" w:val="clear"/>
+        </w:rPr>
+        <w:t xml:space="preserve"> conjuntos de dados, mas normalmente o seu desempenho </w:t>
+      </w:r>
+      <w:r>
+        <w:rPr>
+          <w:rFonts w:eastAsia="TimesNewRomanPS-BoldMT" w:cs="TimesNewRomanPS-BoldMT" w:ascii="TimesNewRomanPS-BoldMT" w:hAnsi="TimesNewRomanPS-BoldMT"/>
+          <w:b/>
+          <w:bCs/>
+          <w:color w:val="000000"/>
           <w:kern w:val="2"/>
           <w:sz w:val="24"/>
           <w:szCs w:val="24"/>
           <w:shd w:fill="FFFF00" w:val="clear"/>
           <w:lang w:val="pt-PT" w:eastAsia="en-US" w:bidi="ar-SA"/>
         </w:rPr>
-        <w:t>é pior do que outros classificadores mais avançados, especialmente quando a dataset não é suficiente grande ou bem representada em dados</w:t>
+        <w:t xml:space="preserve">é pior do que outros classificadores mais avançados, especialmente quando a dataset </w:t>
+      </w:r>
+      <w:r>
+        <w:rPr>
+          <w:rFonts w:eastAsia="TimesNewRomanPS-BoldMT" w:cs="TimesNewRomanPS-BoldMT" w:ascii="TimesNewRomanPS-BoldMT" w:hAnsi="TimesNewRomanPS-BoldMT"/>
+          <w:b/>
+          <w:bCs/>
+          <w:color w:val="000000"/>
+          <w:kern w:val="2"/>
+          <w:sz w:val="24"/>
+          <w:szCs w:val="24"/>
+          <w:shd w:fill="FFFF00" w:val="clear"/>
+          <w:lang w:val="pt-PT" w:eastAsia="en-US" w:bidi="ar-SA"/>
+        </w:rPr>
+        <w:t>tem muitas instâncias para classificar independentemente as suas características</w:t>
+      </w:r>
+      <w:r>
+        <w:rPr>
+          <w:rFonts w:eastAsia="TimesNewRomanPS-BoldMT" w:cs="TimesNewRomanPS-BoldMT" w:ascii="TimesNewRomanPS-BoldMT" w:hAnsi="TimesNewRomanPS-BoldMT"/>
+          <w:b/>
+          <w:bCs/>
+          <w:color w:val="000000"/>
+          <w:kern w:val="2"/>
+          <w:sz w:val="24"/>
+          <w:szCs w:val="24"/>
+          <w:shd w:fill="FFFF00" w:val="clear"/>
+          <w:lang w:val="pt-PT" w:eastAsia="en-US" w:bidi="ar-SA"/>
+        </w:rPr>
+        <w:t xml:space="preserve"> ou </w:t>
+      </w:r>
+      <w:r>
+        <w:rPr>
+          <w:rFonts w:eastAsia="TimesNewRomanPS-BoldMT" w:cs="TimesNewRomanPS-BoldMT" w:ascii="TimesNewRomanPS-BoldMT" w:hAnsi="TimesNewRomanPS-BoldMT"/>
+          <w:b/>
+          <w:bCs/>
+          <w:color w:val="000000"/>
+          <w:kern w:val="2"/>
+          <w:sz w:val="24"/>
+          <w:szCs w:val="24"/>
+          <w:shd w:fill="FFFF00" w:val="clear"/>
+          <w:lang w:val="pt-PT" w:eastAsia="en-US" w:bidi="ar-SA"/>
+        </w:rPr>
+        <w:t>os seus atributos não estão bem representadas</w:t>
       </w:r>
       <w:r>
         <w:rPr>
@@ -3495,21 +3633,7 @@
           <w:shd w:fill="FFFF00" w:val="clear"/>
           <w:lang w:val="pt-PT" w:eastAsia="en-US" w:bidi="ar-SA"/>
         </w:rPr>
-        <w:t xml:space="preserve">é um modelo mais avançado do que os outros dois modelos referidos, sendo o que usa um modelo do tipo árvore de grafos. O modelo começa pelo um nó de raiz que contém a dataset toda, em seguida é dividida em </w:t>
-      </w:r>
-      <w:r>
-        <w:rPr>
-          <w:rFonts w:eastAsia="TimesNewRomanPS-BoldMT" w:cs="TimesNewRomanPS-BoldMT" w:ascii="TimesNewRomanPS-BoldMT" w:hAnsi="TimesNewRomanPS-BoldMT"/>
-          <w:b/>
-          <w:bCs/>
-          <w:color w:val="000000"/>
-          <w:kern w:val="2"/>
-          <w:sz w:val="24"/>
-          <w:szCs w:val="24"/>
-          <w:shd w:fill="FFFF00" w:val="clear"/>
-          <w:lang w:val="pt-PT" w:eastAsia="en-US" w:bidi="ar-SA"/>
-        </w:rPr>
-        <w:t>dois nós de subdados da dataset. Isto é feito recursivamente para cada divisão de nós de dados. A divisão de nós é terminado quando não existe valor para a previsão de classes. Induction tree tem tendência a overfitting, para não acontecer tal coisa, é necessário remover nós que não têm valor para previsão ou até adicionar um valor máximo de profundidade de divisão de nós. No final, com esta complexidade induction tree é o melhor modelo para classificação entre os modelos referidos, mas pelo um preço de um custo computacional.</w:t>
+        <w:t xml:space="preserve">é um modelo mais avançado do que os outros dois modelos referidos, sendo o que usa um modelo do tipo árvore de grafos. O modelo começa pelo um nó de raiz que contém a dataset toda, em seguida é dividida em dois nós de subdados da dataset. Isto é feito recursivamente para cada divisão de nós de dados. A divisão de nós é terminado quando não existe valor para a previsão de classes. Induction tree tem tendência a overfitting, para não acontecer tal coisa, é necessário remover nós que não têm valor para previsão ou até adicionar um valor máximo de profundidade de divisão de nós. No final, com esta complexidade induction tree é o melhor modelo para classificação entre os modelos referidos, mas pelo um preço de um custo computacional. </w:t>
       </w:r>
     </w:p>
     <w:p>
@@ -3522,6 +3646,286 @@
         <w:rPr/>
       </w:pPr>
       <w:r>
+        <w:rPr>
+          <w:rFonts w:eastAsia="TimesNewRomanPS-BoldMT" w:cs="TimesNewRomanPS-BoldMT" w:ascii="TimesNewRomanPS-BoldMT" w:hAnsi="TimesNewRomanPS-BoldMT"/>
+          <w:b/>
+          <w:bCs/>
+          <w:color w:val="000000"/>
+          <w:kern w:val="2"/>
+          <w:sz w:val="24"/>
+          <w:szCs w:val="24"/>
+          <w:shd w:fill="FFFF00" w:val="clear"/>
+          <w:lang w:val="pt-PT" w:eastAsia="en-US" w:bidi="ar-SA"/>
+        </w:rPr>
+        <w:t xml:space="preserve">O classificador </w:t>
+      </w:r>
+      <w:r>
+        <w:rPr>
+          <w:rFonts w:eastAsia="TimesNewRomanPS-BoldMT" w:cs="TimesNewRomanPS-BoldMT" w:ascii="TimesNewRomanPS-BoldMT" w:hAnsi="TimesNewRomanPS-BoldMT"/>
+          <w:b/>
+          <w:bCs/>
+          <w:color w:val="000000"/>
+          <w:kern w:val="2"/>
+          <w:sz w:val="24"/>
+          <w:szCs w:val="24"/>
+          <w:shd w:fill="FFFF00" w:val="clear"/>
+          <w:lang w:val="pt-PT" w:eastAsia="en-US" w:bidi="ar-SA"/>
+        </w:rPr>
+        <w:t>induction tree</w:t>
+      </w:r>
+      <w:r>
+        <w:rPr>
+          <w:rFonts w:eastAsia="TimesNewRomanPS-BoldMT" w:cs="TimesNewRomanPS-BoldMT" w:ascii="TimesNewRomanPS-BoldMT" w:hAnsi="TimesNewRomanPS-BoldMT"/>
+          <w:b/>
+          <w:bCs/>
+          <w:color w:val="000000"/>
+          <w:kern w:val="2"/>
+          <w:sz w:val="24"/>
+          <w:szCs w:val="24"/>
+          <w:shd w:fill="FFFF00" w:val="clear"/>
+          <w:lang w:val="pt-PT" w:eastAsia="en-US" w:bidi="ar-SA"/>
+        </w:rPr>
+        <w:t xml:space="preserve"> é um modelo que utiliza uma estrutura em forma de árvore para realizar classificações. O processo começa com um </w:t>
+      </w:r>
+      <w:r>
+        <w:rPr>
+          <w:rStyle w:val="StrongEmphasis"/>
+          <w:rFonts w:eastAsia="TimesNewRomanPS-BoldMT" w:cs="TimesNewRomanPS-BoldMT" w:ascii="TimesNewRomanPS-BoldMT" w:hAnsi="TimesNewRomanPS-BoldMT"/>
+          <w:color w:val="000000"/>
+          <w:kern w:val="2"/>
+          <w:sz w:val="24"/>
+          <w:szCs w:val="24"/>
+          <w:shd w:fill="FFFF00" w:val="clear"/>
+          <w:lang w:val="pt-PT" w:eastAsia="en-US" w:bidi="ar-SA"/>
+        </w:rPr>
+        <w:t>nó raiz</w:t>
+      </w:r>
+      <w:r>
+        <w:rPr>
+          <w:rFonts w:eastAsia="TimesNewRomanPS-BoldMT" w:cs="TimesNewRomanPS-BoldMT" w:ascii="TimesNewRomanPS-BoldMT" w:hAnsi="TimesNewRomanPS-BoldMT"/>
+          <w:b/>
+          <w:bCs/>
+          <w:color w:val="000000"/>
+          <w:kern w:val="2"/>
+          <w:sz w:val="24"/>
+          <w:szCs w:val="24"/>
+          <w:shd w:fill="FFFF00" w:val="clear"/>
+          <w:lang w:val="pt-PT" w:eastAsia="en-US" w:bidi="ar-SA"/>
+        </w:rPr>
+        <w:t xml:space="preserve">, que contém todo o conjunto de dados, e em seguida divide-o em </w:t>
+      </w:r>
+      <w:r>
+        <w:rPr>
+          <w:rStyle w:val="StrongEmphasis"/>
+          <w:rFonts w:eastAsia="TimesNewRomanPS-BoldMT" w:cs="TimesNewRomanPS-BoldMT" w:ascii="TimesNewRomanPS-BoldMT" w:hAnsi="TimesNewRomanPS-BoldMT"/>
+          <w:color w:val="000000"/>
+          <w:kern w:val="2"/>
+          <w:sz w:val="24"/>
+          <w:szCs w:val="24"/>
+          <w:shd w:fill="FFFF00" w:val="clear"/>
+          <w:lang w:val="pt-PT" w:eastAsia="en-US" w:bidi="ar-SA"/>
+        </w:rPr>
+        <w:t>subconjuntos</w:t>
+      </w:r>
+      <w:r>
+        <w:rPr>
+          <w:rFonts w:eastAsia="TimesNewRomanPS-BoldMT" w:cs="TimesNewRomanPS-BoldMT" w:ascii="TimesNewRomanPS-BoldMT" w:hAnsi="TimesNewRomanPS-BoldMT"/>
+          <w:b/>
+          <w:bCs/>
+          <w:color w:val="000000"/>
+          <w:kern w:val="2"/>
+          <w:sz w:val="24"/>
+          <w:szCs w:val="24"/>
+          <w:shd w:fill="FFFF00" w:val="clear"/>
+          <w:lang w:val="pt-PT" w:eastAsia="en-US" w:bidi="ar-SA"/>
+        </w:rPr>
+        <w:t xml:space="preserve"> com base nos valores das variáveis de entrada. Essa divisão ocorre </w:t>
+      </w:r>
+      <w:r>
+        <w:rPr>
+          <w:rStyle w:val="StrongEmphasis"/>
+          <w:rFonts w:eastAsia="TimesNewRomanPS-BoldMT" w:cs="TimesNewRomanPS-BoldMT" w:ascii="TimesNewRomanPS-BoldMT" w:hAnsi="TimesNewRomanPS-BoldMT"/>
+          <w:color w:val="000000"/>
+          <w:kern w:val="2"/>
+          <w:sz w:val="24"/>
+          <w:szCs w:val="24"/>
+          <w:shd w:fill="FFFF00" w:val="clear"/>
+          <w:lang w:val="pt-PT" w:eastAsia="en-US" w:bidi="ar-SA"/>
+        </w:rPr>
+        <w:t>recursivamente</w:t>
+      </w:r>
+      <w:r>
+        <w:rPr>
+          <w:rFonts w:eastAsia="TimesNewRomanPS-BoldMT" w:cs="TimesNewRomanPS-BoldMT" w:ascii="TimesNewRomanPS-BoldMT" w:hAnsi="TimesNewRomanPS-BoldMT"/>
+          <w:b/>
+          <w:bCs/>
+          <w:color w:val="000000"/>
+          <w:kern w:val="2"/>
+          <w:sz w:val="24"/>
+          <w:szCs w:val="24"/>
+          <w:shd w:fill="FFFF00" w:val="clear"/>
+          <w:lang w:val="pt-PT" w:eastAsia="en-US" w:bidi="ar-SA"/>
+        </w:rPr>
+        <w:t xml:space="preserve">, criando nós filhos até que se atinja uma condição de paragem — por exemplo, quando todos os exemplos de um nó pertencem à mesma classe ou quando não há ganho informativo em novas divisões. As árvores de decisão tendem a sofrer de </w:t>
+      </w:r>
+      <w:r>
+        <w:rPr>
+          <w:rStyle w:val="StrongEmphasis"/>
+          <w:rFonts w:eastAsia="TimesNewRomanPS-BoldMT" w:cs="TimesNewRomanPS-BoldMT" w:ascii="TimesNewRomanPS-BoldMT" w:hAnsi="TimesNewRomanPS-BoldMT"/>
+          <w:color w:val="000000"/>
+          <w:kern w:val="2"/>
+          <w:sz w:val="24"/>
+          <w:szCs w:val="24"/>
+          <w:shd w:fill="FFFF00" w:val="clear"/>
+          <w:lang w:val="pt-PT" w:eastAsia="en-US" w:bidi="ar-SA"/>
+        </w:rPr>
+        <w:t>overfitting</w:t>
+      </w:r>
+      <w:r>
+        <w:rPr>
+          <w:rFonts w:eastAsia="TimesNewRomanPS-BoldMT" w:cs="TimesNewRomanPS-BoldMT" w:ascii="TimesNewRomanPS-BoldMT" w:hAnsi="TimesNewRomanPS-BoldMT"/>
+          <w:b/>
+          <w:bCs/>
+          <w:color w:val="000000"/>
+          <w:kern w:val="2"/>
+          <w:sz w:val="24"/>
+          <w:szCs w:val="24"/>
+          <w:shd w:fill="FFFF00" w:val="clear"/>
+          <w:lang w:val="pt-PT" w:eastAsia="en-US" w:bidi="ar-SA"/>
+        </w:rPr>
+        <w:t xml:space="preserve">, especialmente quando crescem demasiado. Para evitar isso, podem aplicar-se técnicas como </w:t>
+      </w:r>
+      <w:r>
+        <w:rPr>
+          <w:rStyle w:val="StrongEmphasis"/>
+          <w:rFonts w:eastAsia="TimesNewRomanPS-BoldMT" w:cs="TimesNewRomanPS-BoldMT" w:ascii="TimesNewRomanPS-BoldMT" w:hAnsi="TimesNewRomanPS-BoldMT"/>
+          <w:color w:val="000000"/>
+          <w:kern w:val="2"/>
+          <w:sz w:val="24"/>
+          <w:szCs w:val="24"/>
+          <w:shd w:fill="FFFF00" w:val="clear"/>
+          <w:lang w:val="pt-PT" w:eastAsia="en-US" w:bidi="ar-SA"/>
+        </w:rPr>
+        <w:t>pruning</w:t>
+      </w:r>
+      <w:r>
+        <w:rPr>
+          <w:rFonts w:eastAsia="TimesNewRomanPS-BoldMT" w:cs="TimesNewRomanPS-BoldMT" w:ascii="TimesNewRomanPS-BoldMT" w:hAnsi="TimesNewRomanPS-BoldMT"/>
+          <w:b/>
+          <w:bCs/>
+          <w:color w:val="000000"/>
+          <w:kern w:val="2"/>
+          <w:sz w:val="24"/>
+          <w:szCs w:val="24"/>
+          <w:shd w:fill="FFFF00" w:val="clear"/>
+          <w:lang w:val="pt-PT" w:eastAsia="en-US" w:bidi="ar-SA"/>
+        </w:rPr>
+        <w:t xml:space="preserve"> (remover nós pouco relevantes) ou </w:t>
+      </w:r>
+      <w:r>
+        <w:rPr>
+          <w:rStyle w:val="StrongEmphasis"/>
+          <w:rFonts w:eastAsia="TimesNewRomanPS-BoldMT" w:cs="TimesNewRomanPS-BoldMT" w:ascii="TimesNewRomanPS-BoldMT" w:hAnsi="TimesNewRomanPS-BoldMT"/>
+          <w:color w:val="000000"/>
+          <w:kern w:val="2"/>
+          <w:sz w:val="24"/>
+          <w:szCs w:val="24"/>
+          <w:shd w:fill="FFFF00" w:val="clear"/>
+          <w:lang w:val="pt-PT" w:eastAsia="en-US" w:bidi="ar-SA"/>
+        </w:rPr>
+        <w:t>limitar a profundidade máxima</w:t>
+      </w:r>
+      <w:r>
+        <w:rPr>
+          <w:rFonts w:eastAsia="TimesNewRomanPS-BoldMT" w:cs="TimesNewRomanPS-BoldMT" w:ascii="TimesNewRomanPS-BoldMT" w:hAnsi="TimesNewRomanPS-BoldMT"/>
+          <w:b/>
+          <w:bCs/>
+          <w:color w:val="000000"/>
+          <w:kern w:val="2"/>
+          <w:sz w:val="24"/>
+          <w:szCs w:val="24"/>
+          <w:shd w:fill="FFFF00" w:val="clear"/>
+          <w:lang w:val="pt-PT" w:eastAsia="en-US" w:bidi="ar-SA"/>
+        </w:rPr>
+        <w:t xml:space="preserve"> da árvore. Apesar do seu custo computacional mais elevado, este modelo é geralmente mais </w:t>
+      </w:r>
+      <w:r>
+        <w:rPr>
+          <w:rStyle w:val="StrongEmphasis"/>
+          <w:rFonts w:eastAsia="TimesNewRomanPS-BoldMT" w:cs="TimesNewRomanPS-BoldMT" w:ascii="TimesNewRomanPS-BoldMT" w:hAnsi="TimesNewRomanPS-BoldMT"/>
+          <w:color w:val="000000"/>
+          <w:kern w:val="2"/>
+          <w:sz w:val="24"/>
+          <w:szCs w:val="24"/>
+          <w:shd w:fill="FFFF00" w:val="clear"/>
+          <w:lang w:val="pt-PT" w:eastAsia="en-US" w:bidi="ar-SA"/>
+        </w:rPr>
+        <w:t>flexível e interpretável</w:t>
+      </w:r>
+      <w:r>
+        <w:rPr>
+          <w:rFonts w:eastAsia="TimesNewRomanPS-BoldMT" w:cs="TimesNewRomanPS-BoldMT" w:ascii="TimesNewRomanPS-BoldMT" w:hAnsi="TimesNewRomanPS-BoldMT"/>
+          <w:b/>
+          <w:bCs/>
+          <w:color w:val="000000"/>
+          <w:kern w:val="2"/>
+          <w:sz w:val="24"/>
+          <w:szCs w:val="24"/>
+          <w:shd w:fill="FFFF00" w:val="clear"/>
+          <w:lang w:val="pt-PT" w:eastAsia="en-US" w:bidi="ar-SA"/>
+        </w:rPr>
+        <w:t xml:space="preserve"> do que outros classificadores, podendo alcançar bom desempenho dependendo do problema, </w:t>
+      </w:r>
+      <w:r>
+        <w:rPr>
+          <w:rFonts w:eastAsia="TimesNewRomanPS-BoldMT" w:cs="TimesNewRomanPS-BoldMT" w:ascii="TimesNewRomanPS-BoldMT" w:hAnsi="TimesNewRomanPS-BoldMT"/>
+          <w:b/>
+          <w:bCs/>
+          <w:color w:val="000000"/>
+          <w:kern w:val="2"/>
+          <w:sz w:val="24"/>
+          <w:szCs w:val="24"/>
+          <w:shd w:fill="FFFF00" w:val="clear"/>
+          <w:lang w:val="pt-PT" w:eastAsia="en-US" w:bidi="ar-SA"/>
+        </w:rPr>
+        <w:t>mas é dependente de uma grande quantidade de instâncias numa dataset</w:t>
+      </w:r>
+      <w:r>
+        <w:rPr>
+          <w:rFonts w:eastAsia="TimesNewRomanPS-BoldMT" w:cs="TimesNewRomanPS-BoldMT" w:ascii="TimesNewRomanPS-BoldMT" w:hAnsi="TimesNewRomanPS-BoldMT"/>
+          <w:b/>
+          <w:bCs/>
+          <w:color w:val="000000"/>
+          <w:kern w:val="2"/>
+          <w:sz w:val="24"/>
+          <w:szCs w:val="24"/>
+          <w:shd w:fill="FFFF00" w:val="clear"/>
+          <w:lang w:val="pt-PT" w:eastAsia="en-US" w:bidi="ar-SA"/>
+        </w:rPr>
+        <w:t>.</w:t>
+      </w:r>
+    </w:p>
+    <w:p>
+      <w:pPr>
+        <w:pStyle w:val="Normal"/>
+        <w:widowControl/>
+        <w:spacing w:lineRule="auto" w:line="259" w:before="0" w:after="160"/>
+        <w:ind w:left="0" w:right="0" w:hanging="0"/>
+        <w:jc w:val="left"/>
+        <w:rPr>
+          <w:rFonts w:ascii="TimesNewRomanPS-BoldMT" w:hAnsi="TimesNewRomanPS-BoldMT" w:eastAsia="TimesNewRomanPS-BoldMT" w:cs="TimesNewRomanPS-BoldMT"/>
+          <w:b/>
+          <w:b/>
+          <w:bCs/>
+          <w:color w:val="000000"/>
+          <w:kern w:val="2"/>
+          <w:sz w:val="24"/>
+          <w:szCs w:val="24"/>
+          <w:shd w:fill="FFFF00" w:val="clear"/>
+          <w:lang w:val="pt-PT" w:eastAsia="en-US" w:bidi="ar-SA"/>
+        </w:rPr>
+      </w:pPr>
+      <w:r>
         <w:rPr/>
       </w:r>
     </w:p>
@@ -3540,11 +3944,13 @@
           <w:b/>
           <w:bCs/>
           <w:color w:val="000000"/>
-          <w:sz w:val="28"/>
-          <w:szCs w:val="28"/>
-          <w:shd w:fill="FFFF00" w:val="clear"/>
-        </w:rPr>
-        <w:t>3. Conclusão</w:t>
+          <w:kern w:val="2"/>
+          <w:sz w:val="24"/>
+          <w:szCs w:val="24"/>
+          <w:shd w:fill="FFFF00" w:val="clear"/>
+          <w:lang w:val="pt-PT" w:eastAsia="en-US" w:bidi="ar-SA"/>
+        </w:rPr>
+        <w:t>2.7 Avaliações métricas</w:t>
       </w:r>
     </w:p>
     <w:p>
@@ -3554,6 +3960,437 @@
         <w:spacing w:lineRule="auto" w:line="259" w:before="0" w:after="160"/>
         <w:ind w:left="0" w:right="0" w:hanging="0"/>
         <w:jc w:val="left"/>
+        <w:rPr/>
+      </w:pPr>
+      <w:r>
+        <w:rPr>
+          <w:rFonts w:eastAsia="TimesNewRomanPS-BoldMT" w:cs="TimesNewRomanPS-BoldMT" w:ascii="TimesNewRomanPS-BoldMT" w:hAnsi="TimesNewRomanPS-BoldMT"/>
+          <w:b/>
+          <w:bCs/>
+          <w:color w:val="000000"/>
+          <w:kern w:val="2"/>
+          <w:sz w:val="24"/>
+          <w:szCs w:val="24"/>
+          <w:shd w:fill="FFFF00" w:val="clear"/>
+          <w:lang w:val="pt-PT" w:eastAsia="en-US" w:bidi="ar-SA"/>
+        </w:rPr>
+        <w:t>Foi criado resultados experimentais em que compara os três classificadores usados no projeto a partir da taxa de acerto. Nesta comparação foram usadas duas datasets com características do ficheiro d01_lenses.xls: dataset.tab e dataset1.tab. O ficheiro dataset.tab tem as mesmas instâncias e atributos que o ficheiro d01_lenses.xls tem, em que contém 4 atributos (age, prescription, astigmatic e tear_rate) e 16 instâncias. E o ficheiro dataset1.tab tem as mesmas características e classes que o ficheiro  d01_lenses.xls tem, mas foi gerado uma abundâncias de instâncias adicionais para obter uma dataset de grandes dimensões, a dataset contém 2050 instâncias.</w:t>
+      </w:r>
+    </w:p>
+    <w:p>
+      <w:pPr>
+        <w:pStyle w:val="Normal"/>
+        <w:widowControl/>
+        <w:spacing w:lineRule="auto" w:line="259" w:before="0" w:after="160"/>
+        <w:ind w:left="0" w:right="0" w:hanging="0"/>
+        <w:jc w:val="left"/>
+        <w:rPr/>
+      </w:pPr>
+      <w:r>
+        <w:rPr>
+          <w:rFonts w:eastAsia="TimesNewRomanPS-BoldMT" w:cs="TimesNewRomanPS-BoldMT" w:ascii="TimesNewRomanPS-BoldMT" w:hAnsi="TimesNewRomanPS-BoldMT"/>
+          <w:b/>
+          <w:bCs/>
+          <w:color w:val="000000"/>
+          <w:kern w:val="2"/>
+          <w:sz w:val="24"/>
+          <w:szCs w:val="24"/>
+          <w:shd w:fill="FFFF00" w:val="clear"/>
+          <w:lang w:val="pt-PT" w:eastAsia="en-US" w:bidi="ar-SA"/>
+        </w:rPr>
+        <w:t xml:space="preserve">Usando o script: compare_models.py, foi gerado gráficos que compara os classificadores 1 Rule, induction tree e naive bayes pela taxa de acerto ao utilizar as duas datasets na divisão </w:t>
+      </w:r>
+      <w:r>
+        <w:rPr>
+          <w:rFonts w:eastAsia="TimesNewRomanPS-BoldMT" w:cs="TimesNewRomanPS-BoldMT" w:ascii="TimesNewRomanPS-BoldMT" w:hAnsi="TimesNewRomanPS-BoldMT"/>
+          <w:b/>
+          <w:bCs/>
+          <w:color w:val="000000"/>
+          <w:kern w:val="2"/>
+          <w:sz w:val="24"/>
+          <w:szCs w:val="24"/>
+          <w:shd w:fill="FFFF00" w:val="clear"/>
+          <w:lang w:val="pt-PT" w:eastAsia="en-US" w:bidi="ar-SA"/>
+        </w:rPr>
+        <w:t xml:space="preserve">de dataset </w:t>
+      </w:r>
+      <w:r>
+        <w:rPr>
+          <w:rFonts w:eastAsia="TimesNewRomanPS-BoldMT" w:cs="TimesNewRomanPS-BoldMT" w:ascii="TimesNewRomanPS-BoldMT" w:hAnsi="TimesNewRomanPS-BoldMT"/>
+          <w:b/>
+          <w:bCs/>
+          <w:color w:val="000000"/>
+          <w:kern w:val="2"/>
+          <w:sz w:val="24"/>
+          <w:szCs w:val="24"/>
+          <w:shd w:fill="FFFF00" w:val="clear"/>
+          <w:lang w:val="pt-PT" w:eastAsia="en-US" w:bidi="ar-SA"/>
+        </w:rPr>
+        <w:t xml:space="preserve">de teste. </w:t>
+      </w:r>
+      <w:r>
+        <w:rPr>
+          <w:rFonts w:eastAsia="TimesNewRomanPS-BoldMT" w:cs="TimesNewRomanPS-BoldMT" w:ascii="TimesNewRomanPS-BoldMT" w:hAnsi="TimesNewRomanPS-BoldMT"/>
+          <w:b/>
+          <w:bCs/>
+          <w:color w:val="000000"/>
+          <w:kern w:val="2"/>
+          <w:sz w:val="24"/>
+          <w:szCs w:val="24"/>
+          <w:shd w:fill="FFFF00" w:val="clear"/>
+          <w:lang w:val="pt-PT" w:eastAsia="en-US" w:bidi="ar-SA"/>
+        </w:rPr>
+        <w:t>(Existe um ficheiro README que explica como utilizar o script de avaliação métrica).</w:t>
+      </w:r>
+      <w:r>
+        <w:rPr>
+          <w:rFonts w:eastAsia="TimesNewRomanPS-BoldMT" w:cs="TimesNewRomanPS-BoldMT" w:ascii="TimesNewRomanPS-BoldMT" w:hAnsi="TimesNewRomanPS-BoldMT"/>
+          <w:b/>
+          <w:bCs/>
+          <w:color w:val="000000"/>
+          <w:kern w:val="2"/>
+          <w:sz w:val="24"/>
+          <w:szCs w:val="24"/>
+          <w:shd w:fill="FFFF00" w:val="clear"/>
+          <w:lang w:val="pt-PT" w:eastAsia="en-US" w:bidi="ar-SA"/>
+        </w:rPr>
+        <w:t xml:space="preserve"> Nos </w:t>
+      </w:r>
+      <w:r>
+        <w:rPr>
+          <w:rFonts w:eastAsia="TimesNewRomanPS-BoldMT" w:cs="TimesNewRomanPS-BoldMT" w:ascii="TimesNewRomanPS-BoldMT" w:hAnsi="TimesNewRomanPS-BoldMT"/>
+          <w:b/>
+          <w:bCs/>
+          <w:color w:val="000000"/>
+          <w:kern w:val="2"/>
+          <w:sz w:val="24"/>
+          <w:szCs w:val="24"/>
+          <w:shd w:fill="FFFF00" w:val="clear"/>
+          <w:lang w:val="pt-PT" w:eastAsia="en-US" w:bidi="ar-SA"/>
+        </w:rPr>
+        <w:t>seguintes dois gráficos estão apresentados as comparações entre os modelos ao executar N vezes a mesma dataset e fazer a média da taxa de acerto de todas as execuções de teste dos modelos. Neste caso ambos os gráficos foram executados 100 vezes nas duas datasets:</w:t>
+      </w:r>
+    </w:p>
+    <w:p>
+      <w:pPr>
+        <w:pStyle w:val="Normal"/>
+        <w:widowControl/>
+        <w:spacing w:lineRule="auto" w:line="259" w:before="0" w:after="160"/>
+        <w:ind w:left="0" w:right="0" w:hanging="0"/>
+        <w:jc w:val="left"/>
+        <w:rPr/>
+      </w:pPr>
+      <w:r>
+        <w:rPr/>
+        <w:drawing>
+          <wp:anchor behindDoc="0" distT="0" distB="0" distL="0" distR="0" simplePos="0" locked="0" layoutInCell="0" allowOverlap="1" relativeHeight="9">
+            <wp:simplePos x="0" y="0"/>
+            <wp:positionH relativeFrom="column">
+              <wp:posOffset>83185</wp:posOffset>
+            </wp:positionH>
+            <wp:positionV relativeFrom="paragraph">
+              <wp:posOffset>92710</wp:posOffset>
+            </wp:positionV>
+            <wp:extent cx="5400040" cy="3221355"/>
+            <wp:effectExtent l="0" t="0" r="0" b="0"/>
+            <wp:wrapSquare wrapText="largest"/>
+            <wp:docPr id="7" name="Image5" descr=""/>
+            <wp:cNvGraphicFramePr>
+              <a:graphicFrameLocks xmlns:a="http://schemas.openxmlformats.org/drawingml/2006/main" noChangeAspect="1"/>
+            </wp:cNvGraphicFramePr>
+            <a:graphic xmlns:a="http://schemas.openxmlformats.org/drawingml/2006/main">
+              <a:graphicData uri="http://schemas.openxmlformats.org/drawingml/2006/picture">
+                <pic:pic xmlns:pic="http://schemas.openxmlformats.org/drawingml/2006/picture">
+                  <pic:nvPicPr>
+                    <pic:cNvPr id="7" name="Image5" descr=""/>
+                    <pic:cNvPicPr>
+                      <a:picLocks noChangeAspect="1" noChangeArrowheads="1"/>
+                    </pic:cNvPicPr>
+                  </pic:nvPicPr>
+                  <pic:blipFill>
+                    <a:blip r:embed="rId8"/>
+                    <a:stretch>
+                      <a:fillRect/>
+                    </a:stretch>
+                  </pic:blipFill>
+                  <pic:spPr bwMode="auto">
+                    <a:xfrm>
+                      <a:off x="0" y="0"/>
+                      <a:ext cx="5400040" cy="3221355"/>
+                    </a:xfrm>
+                    <a:prstGeom prst="rect">
+                      <a:avLst/>
+                    </a:prstGeom>
+                  </pic:spPr>
+                </pic:pic>
+              </a:graphicData>
+            </a:graphic>
+          </wp:anchor>
+        </w:drawing>
+      </w:r>
+    </w:p>
+    <w:p>
+      <w:pPr>
+        <w:pStyle w:val="Normal"/>
+        <w:widowControl/>
+        <w:spacing w:lineRule="auto" w:line="259" w:before="0" w:after="160"/>
+        <w:ind w:left="0" w:right="0" w:hanging="0"/>
+        <w:jc w:val="left"/>
+        <w:rPr>
+          <w:rFonts w:ascii="TimesNewRomanPS-BoldMT" w:hAnsi="TimesNewRomanPS-BoldMT" w:eastAsia="TimesNewRomanPS-BoldMT" w:cs="TimesNewRomanPS-BoldMT"/>
+          <w:b/>
+          <w:b/>
+          <w:bCs/>
+          <w:color w:val="000000"/>
+          <w:kern w:val="2"/>
+          <w:sz w:val="24"/>
+          <w:szCs w:val="24"/>
+          <w:shd w:fill="FFFF00" w:val="clear"/>
+          <w:lang w:val="pt-PT" w:eastAsia="en-US" w:bidi="ar-SA"/>
+        </w:rPr>
+      </w:pPr>
+      <w:r>
+        <w:rPr/>
+        <w:drawing>
+          <wp:anchor behindDoc="0" distT="0" distB="0" distL="0" distR="0" simplePos="0" locked="0" layoutInCell="0" allowOverlap="1" relativeHeight="10">
+            <wp:simplePos x="0" y="0"/>
+            <wp:positionH relativeFrom="column">
+              <wp:posOffset>0</wp:posOffset>
+            </wp:positionH>
+            <wp:positionV relativeFrom="paragraph">
+              <wp:posOffset>214630</wp:posOffset>
+            </wp:positionV>
+            <wp:extent cx="5400040" cy="3221355"/>
+            <wp:effectExtent l="0" t="0" r="0" b="0"/>
+            <wp:wrapSquare wrapText="largest"/>
+            <wp:docPr id="8" name="Image6" descr=""/>
+            <wp:cNvGraphicFramePr>
+              <a:graphicFrameLocks xmlns:a="http://schemas.openxmlformats.org/drawingml/2006/main" noChangeAspect="1"/>
+            </wp:cNvGraphicFramePr>
+            <a:graphic xmlns:a="http://schemas.openxmlformats.org/drawingml/2006/main">
+              <a:graphicData uri="http://schemas.openxmlformats.org/drawingml/2006/picture">
+                <pic:pic xmlns:pic="http://schemas.openxmlformats.org/drawingml/2006/picture">
+                  <pic:nvPicPr>
+                    <pic:cNvPr id="8" name="Image6" descr=""/>
+                    <pic:cNvPicPr>
+                      <a:picLocks noChangeAspect="1" noChangeArrowheads="1"/>
+                    </pic:cNvPicPr>
+                  </pic:nvPicPr>
+                  <pic:blipFill>
+                    <a:blip r:embed="rId9"/>
+                    <a:stretch>
+                      <a:fillRect/>
+                    </a:stretch>
+                  </pic:blipFill>
+                  <pic:spPr bwMode="auto">
+                    <a:xfrm>
+                      <a:off x="0" y="0"/>
+                      <a:ext cx="5400040" cy="3221355"/>
+                    </a:xfrm>
+                    <a:prstGeom prst="rect">
+                      <a:avLst/>
+                    </a:prstGeom>
+                  </pic:spPr>
+                </pic:pic>
+              </a:graphicData>
+            </a:graphic>
+          </wp:anchor>
+        </w:drawing>
+      </w:r>
+    </w:p>
+    <w:p>
+      <w:pPr>
+        <w:pStyle w:val="Normal"/>
+        <w:widowControl/>
+        <w:spacing w:lineRule="auto" w:line="259" w:before="0" w:after="160"/>
+        <w:ind w:left="0" w:right="0" w:hanging="0"/>
+        <w:jc w:val="left"/>
+        <w:rPr>
+          <w:rFonts w:ascii="TimesNewRomanPS-BoldMT" w:hAnsi="TimesNewRomanPS-BoldMT" w:eastAsia="TimesNewRomanPS-BoldMT" w:cs="TimesNewRomanPS-BoldMT"/>
+          <w:b/>
+          <w:b/>
+          <w:bCs/>
+          <w:color w:val="000000"/>
+          <w:kern w:val="2"/>
+          <w:sz w:val="24"/>
+          <w:szCs w:val="24"/>
+          <w:shd w:fill="FFFF00" w:val="clear"/>
+          <w:lang w:val="pt-PT" w:eastAsia="en-US" w:bidi="ar-SA"/>
+        </w:rPr>
+      </w:pPr>
+      <w:r>
+        <w:rPr/>
+      </w:r>
+    </w:p>
+    <w:p>
+      <w:pPr>
+        <w:pStyle w:val="Normal"/>
+        <w:widowControl/>
+        <w:spacing w:lineRule="auto" w:line="259" w:before="0" w:after="160"/>
+        <w:ind w:left="0" w:right="0" w:hanging="0"/>
+        <w:jc w:val="left"/>
+        <w:rPr>
+          <w:rFonts w:ascii="TimesNewRomanPS-BoldMT" w:hAnsi="TimesNewRomanPS-BoldMT" w:eastAsia="TimesNewRomanPS-BoldMT" w:cs="TimesNewRomanPS-BoldMT"/>
+          <w:b/>
+          <w:b/>
+          <w:bCs/>
+          <w:color w:val="000000"/>
+          <w:kern w:val="2"/>
+          <w:sz w:val="24"/>
+          <w:szCs w:val="24"/>
+          <w:shd w:fill="FFFF00" w:val="clear"/>
+          <w:lang w:val="pt-PT" w:eastAsia="en-US" w:bidi="ar-SA"/>
+        </w:rPr>
+      </w:pPr>
+      <w:r>
+        <w:rPr/>
+      </w:r>
+    </w:p>
+    <w:p>
+      <w:pPr>
+        <w:pStyle w:val="Normal"/>
+        <w:widowControl/>
+        <w:spacing w:lineRule="auto" w:line="259" w:before="0" w:after="160"/>
+        <w:ind w:left="0" w:right="0" w:hanging="0"/>
+        <w:jc w:val="left"/>
+        <w:rPr/>
+      </w:pPr>
+      <w:r>
+        <w:rPr>
+          <w:rFonts w:eastAsia="TimesNewRomanPS-BoldMT" w:cs="TimesNewRomanPS-BoldMT" w:ascii="TimesNewRomanPS-BoldMT" w:hAnsi="TimesNewRomanPS-BoldMT"/>
+          <w:b/>
+          <w:bCs/>
+          <w:color w:val="000000"/>
+          <w:kern w:val="2"/>
+          <w:sz w:val="24"/>
+          <w:szCs w:val="24"/>
+          <w:shd w:fill="FFFF00" w:val="clear"/>
+          <w:lang w:val="pt-PT" w:eastAsia="en-US" w:bidi="ar-SA"/>
+        </w:rPr>
+        <w:t>N</w:t>
+      </w:r>
+      <w:r>
+        <w:rPr>
+          <w:rFonts w:eastAsia="TimesNewRomanPS-BoldMT" w:cs="TimesNewRomanPS-BoldMT" w:ascii="TimesNewRomanPS-BoldMT" w:hAnsi="TimesNewRomanPS-BoldMT"/>
+          <w:b/>
+          <w:bCs/>
+          <w:color w:val="000000"/>
+          <w:kern w:val="2"/>
+          <w:sz w:val="24"/>
+          <w:szCs w:val="24"/>
+          <w:shd w:fill="FFFF00" w:val="clear"/>
+          <w:lang w:val="pt-PT" w:eastAsia="en-US" w:bidi="ar-SA"/>
+        </w:rPr>
+        <w:t xml:space="preserve">o primeiro gráfico, é avaliado os modelos usando a dataset: dataset.tab que contém 16 instâncias verifica-se que o classificador naive bayes tem melhor desempenho, isto é porque utiliza a probilidade condicional independente para estimar a classe o que consegue generalizar a previsão de classes numa dataset com poucas amostras, ao contrário do do induction tree, o classificador é prejudicado por overfitting por não ter uma grande quantidade de amostras para memorizar </w:t>
+      </w:r>
+      <w:r>
+        <w:rPr>
+          <w:rFonts w:eastAsia="TimesNewRomanPS-BoldMT" w:cs="TimesNewRomanPS-BoldMT" w:ascii="TimesNewRomanPS-BoldMT" w:hAnsi="TimesNewRomanPS-BoldMT"/>
+          <w:b/>
+          <w:bCs/>
+          <w:color w:val="000000"/>
+          <w:kern w:val="2"/>
+          <w:sz w:val="24"/>
+          <w:szCs w:val="24"/>
+          <w:shd w:fill="FFFF00" w:val="clear"/>
+          <w:lang w:val="pt-PT" w:eastAsia="en-US" w:bidi="ar-SA"/>
+        </w:rPr>
+        <w:t>melhor os dados que são treinados. Por último o 1 Rule é o que tem pior desempenho por só usar uma única característica para prever classes, descartando todas as outras features na previsão.</w:t>
+      </w:r>
+    </w:p>
+    <w:p>
+      <w:pPr>
+        <w:pStyle w:val="Normal"/>
+        <w:widowControl/>
+        <w:spacing w:lineRule="auto" w:line="259" w:before="0" w:after="160"/>
+        <w:ind w:left="0" w:right="0" w:hanging="0"/>
+        <w:jc w:val="left"/>
+        <w:rPr/>
+      </w:pPr>
+      <w:r>
+        <w:rPr>
+          <w:rFonts w:eastAsia="TimesNewRomanPS-BoldMT" w:cs="TimesNewRomanPS-BoldMT" w:ascii="TimesNewRomanPS-BoldMT" w:hAnsi="TimesNewRomanPS-BoldMT"/>
+          <w:b/>
+          <w:bCs/>
+          <w:color w:val="000000"/>
+          <w:kern w:val="2"/>
+          <w:sz w:val="24"/>
+          <w:szCs w:val="24"/>
+          <w:shd w:fill="FFFF00" w:val="clear"/>
+          <w:lang w:val="pt-PT" w:eastAsia="en-US" w:bidi="ar-SA"/>
+        </w:rPr>
+        <w:t>N</w:t>
+      </w:r>
+      <w:r>
+        <w:rPr>
+          <w:rFonts w:eastAsia="TimesNewRomanPS-BoldMT" w:cs="TimesNewRomanPS-BoldMT" w:ascii="TimesNewRomanPS-BoldMT" w:hAnsi="TimesNewRomanPS-BoldMT"/>
+          <w:b/>
+          <w:bCs/>
+          <w:color w:val="000000"/>
+          <w:kern w:val="2"/>
+          <w:sz w:val="24"/>
+          <w:szCs w:val="24"/>
+          <w:shd w:fill="FFFF00" w:val="clear"/>
+          <w:lang w:val="pt-PT" w:eastAsia="en-US" w:bidi="ar-SA"/>
+        </w:rPr>
+        <w:t>o segundo gráfico, é usado a dataset: dataset1.tab que contém 2050 instâncias que usa as mesmas características e classes da dataset referida anteriormente. Como é visto, induction tree é o modelo com melhor desempenho por ser treinado numa dataset uma grande quantidade de instâncias. A taxa de acerto no classificador naive bayes é pior que o anterior por ser usado uma dataset grande e com isto as características começam a ter uma correlação o que começa a perder a independência entre as features, daí ter pior desempenho. Por fim, 1 Rule continua a ter pior resultado do que os outros modelos, mas melhorou do que no outro dataset, pois é visto que 1 Rule depende da dimensão da dataset, quanto maior a dataset melhor o desempenho do algoritmo 1 Rule.</w:t>
+      </w:r>
+    </w:p>
+    <w:p>
+      <w:pPr>
+        <w:pStyle w:val="Normal"/>
+        <w:widowControl/>
+        <w:spacing w:lineRule="auto" w:line="259" w:before="0" w:after="160"/>
+        <w:ind w:left="0" w:right="0" w:hanging="0"/>
+        <w:jc w:val="left"/>
+        <w:rPr/>
+      </w:pPr>
+      <w:r>
+        <w:rPr/>
+      </w:r>
+    </w:p>
+    <w:p>
+      <w:pPr>
+        <w:pStyle w:val="Normal"/>
+        <w:widowControl/>
+        <w:spacing w:lineRule="auto" w:line="259" w:before="0" w:after="160"/>
+        <w:ind w:left="0" w:right="0" w:hanging="0"/>
+        <w:jc w:val="left"/>
+        <w:rPr/>
+      </w:pPr>
+      <w:r>
+        <w:rPr/>
+      </w:r>
+    </w:p>
+    <w:p>
+      <w:pPr>
+        <w:pStyle w:val="Normal"/>
+        <w:widowControl/>
+        <w:spacing w:lineRule="auto" w:line="259" w:before="0" w:after="160"/>
+        <w:ind w:left="0" w:right="0" w:hanging="0"/>
+        <w:jc w:val="left"/>
+        <w:rPr/>
+      </w:pPr>
+      <w:r>
+        <w:rPr>
+          <w:rFonts w:eastAsia="TimesNewRomanPS-BoldMT" w:cs="TimesNewRomanPS-BoldMT" w:ascii="TimesNewRomanPS-BoldMT" w:hAnsi="TimesNewRomanPS-BoldMT"/>
+          <w:b/>
+          <w:bCs/>
+          <w:color w:val="000000"/>
+          <w:sz w:val="28"/>
+          <w:szCs w:val="28"/>
+          <w:shd w:fill="FFFF00" w:val="clear"/>
+        </w:rPr>
+        <w:t>3. Conclusão</w:t>
+      </w:r>
+    </w:p>
+    <w:p>
+      <w:pPr>
+        <w:pStyle w:val="Normal"/>
+        <w:widowControl/>
+        <w:spacing w:lineRule="auto" w:line="259" w:before="0" w:after="160"/>
+        <w:ind w:left="0" w:right="0" w:hanging="0"/>
+        <w:jc w:val="left"/>
         <w:rPr>
           <w:rFonts w:ascii="Times New Roman" w:hAnsi="Times New Roman" w:cs="Times New Roman"/>
           <w:b/>
@@ -3600,7 +4437,9 @@
         </w:rPr>
       </w:pPr>
       <w:r>
-        <w:rPr/>
+        <w:rPr>
+          <w:rFonts w:cs="Times New Roman" w:ascii="Times New Roman" w:hAnsi="Times New Roman"/>
+        </w:rPr>
       </w:r>
     </w:p>
     <w:p>
@@ -3612,7 +4451,9 @@
         </w:rPr>
       </w:pPr>
       <w:r>
-        <w:rPr/>
+        <w:rPr>
+          <w:rFonts w:cs="Times New Roman" w:ascii="Times New Roman" w:hAnsi="Times New Roman"/>
+        </w:rPr>
       </w:r>
     </w:p>
     <w:p>
@@ -3624,7 +4465,9 @@
         </w:rPr>
       </w:pPr>
       <w:r>
-        <w:rPr/>
+        <w:rPr>
+          <w:rFonts w:cs="Times New Roman" w:ascii="Times New Roman" w:hAnsi="Times New Roman"/>
+        </w:rPr>
       </w:r>
     </w:p>
     <w:p>
@@ -3636,7 +4479,9 @@
         </w:rPr>
       </w:pPr>
       <w:r>
-        <w:rPr/>
+        <w:rPr>
+          <w:rFonts w:cs="Times New Roman" w:ascii="Times New Roman" w:hAnsi="Times New Roman"/>
+        </w:rPr>
       </w:r>
     </w:p>
     <w:p>
@@ -3648,7 +4493,9 @@
         </w:rPr>
       </w:pPr>
       <w:r>
-        <w:rPr/>
+        <w:rPr>
+          <w:rFonts w:cs="Times New Roman" w:ascii="Times New Roman" w:hAnsi="Times New Roman"/>
+        </w:rPr>
       </w:r>
     </w:p>
     <w:p>
@@ -3660,7 +4507,9 @@
         </w:rPr>
       </w:pPr>
       <w:r>
-        <w:rPr/>
+        <w:rPr>
+          <w:rFonts w:cs="Times New Roman" w:ascii="Times New Roman" w:hAnsi="Times New Roman"/>
+        </w:rPr>
       </w:r>
     </w:p>
     <w:p>
@@ -3687,14 +4536,73 @@
         </w:rPr>
         <w:t>ências:</w:t>
         <w:br/>
-        <w:t>https://deepai.org/machine-learning-glossary-and-terms/tree-induction-algorithm</w:t>
+      </w:r>
+      <w:hyperlink r:id="rId11">
+        <w:r>
+          <w:rPr>
+            <w:rStyle w:val="InternetLink"/>
+            <w:rFonts w:eastAsia="Aptos" w:cs="" w:cstheme="minorBidi" w:eastAsiaTheme="minorHAnsi"/>
+            <w:color w:val="auto"/>
+            <w:kern w:val="2"/>
+            <w:sz w:val="22"/>
+            <w:szCs w:val="22"/>
+            <w:lang w:val="pt-PT" w:eastAsia="en-US" w:bidi="ar-SA"/>
+            <w14:ligatures w14:val="standardContextual"/>
+          </w:rPr>
+          <w:t>https://deepai.org/machine-learning-glossary-and-terms/tree-induction-algorithm</w:t>
+        </w:r>
+      </w:hyperlink>
+    </w:p>
+    <w:p>
+      <w:pPr>
+        <w:pStyle w:val="Normal"/>
+        <w:spacing w:before="0" w:after="160"/>
+        <w:rPr>
+          <w:rFonts w:ascii="Times New Roman" w:hAnsi="Times New Roman" w:cs="Times New Roman"/>
+        </w:rPr>
+      </w:pPr>
+      <w:hyperlink r:id="rId13">
+        <w:r>
+          <w:rPr>
+            <w:rStyle w:val="InternetLink"/>
+            <w:rFonts w:eastAsia="Aptos" w:cs="" w:cstheme="minorBidi" w:eastAsiaTheme="minorHAnsi"/>
+            <w:color w:val="auto"/>
+            <w:kern w:val="2"/>
+            <w:sz w:val="22"/>
+            <w:szCs w:val="22"/>
+            <w:lang w:val="pt-PT" w:eastAsia="en-US" w:bidi="ar-SA"/>
+            <w14:ligatures w14:val="standardContextual"/>
+          </w:rPr>
+          <w:t>https://chatgpt.com/share/69091756-21bc-8007-ab7e-b898bce1fdd8</w:t>
+        </w:r>
+      </w:hyperlink>
+    </w:p>
+    <w:p>
+      <w:pPr>
+        <w:pStyle w:val="Normal"/>
+        <w:spacing w:before="0" w:after="160"/>
+        <w:rPr>
+          <w:rFonts w:ascii="Times New Roman" w:hAnsi="Times New Roman" w:cs="Times New Roman"/>
+        </w:rPr>
+      </w:pPr>
+      <w:r>
+        <w:rPr>
+          <w:rFonts w:eastAsia="Aptos" w:cs="" w:cstheme="minorBidi" w:eastAsiaTheme="minorHAnsi"/>
+          <w:color w:val="auto"/>
+          <w:kern w:val="2"/>
+          <w:sz w:val="22"/>
+          <w:szCs w:val="22"/>
+          <w:lang w:val="pt-PT" w:eastAsia="en-US" w:bidi="ar-SA"/>
+          <w14:ligatures w14:val="standardContextual"/>
+        </w:rPr>
+        <w:t>https://chatgpt.com/share/69124dc9-5804-8007-913e-a67a856629a6</w:t>
       </w:r>
     </w:p>
     <w:sectPr>
-      <w:headerReference w:type="default" r:id="rId7"/>
-      <w:headerReference w:type="first" r:id="rId8"/>
-      <w:footerReference w:type="default" r:id="rId9"/>
-      <w:footerReference w:type="first" r:id="rId10"/>
+      <w:headerReference w:type="default" r:id="rId14"/>
+      <w:headerReference w:type="first" r:id="rId15"/>
+      <w:footerReference w:type="default" r:id="rId16"/>
+      <w:footerReference w:type="first" r:id="rId17"/>
       <w:type w:val="nextPage"/>
       <w:pgSz w:w="11906" w:h="16838"/>
       <w:pgMar w:left="1701" w:right="1701" w:gutter="0" w:header="708" w:top="1417" w:footer="708" w:bottom="1417"/>
@@ -3716,7 +4624,7 @@
         <w:docPartGallery w:val="Page Numbers (Bottom of Page)"/>
         <w:docPartUnique w:val="true"/>
       </w:docPartObj>
-      <w:id w:val="128029506"/>
+      <w:id w:val="2138627815"/>
     </w:sdtPr>
     <w:sdtContent>
       <w:p>
@@ -3749,7 +4657,7 @@
           <w:rPr>
             <w:rFonts w:cs="Times New Roman" w:ascii="Times New Roman" w:hAnsi="Times New Roman"/>
           </w:rPr>
-          <w:t>6</w:t>
+          <w:t>7</w:t>
         </w:r>
         <w:r>
           <w:rPr>
@@ -3839,15 +4747,15 @@
           <wp:effectExtent l="0" t="0" r="0" b="0"/>
           <wp:wrapTight wrapText="bothSides">
             <wp:wrapPolygon edited="0">
-              <wp:start x="-23" y="0"/>
-              <wp:lineTo x="-23" y="19504"/>
-              <wp:lineTo x="21009" y="19504"/>
-              <wp:lineTo x="21009" y="15950"/>
-              <wp:lineTo x="18115" y="0"/>
-              <wp:lineTo x="-23" y="0"/>
+              <wp:start x="-28" y="0"/>
+              <wp:lineTo x="-28" y="19490"/>
+              <wp:lineTo x="21002" y="19490"/>
+              <wp:lineTo x="21002" y="15939"/>
+              <wp:lineTo x="18106" y="0"/>
+              <wp:lineTo x="-28" y="0"/>
             </wp:wrapPolygon>
           </wp:wrapTight>
-          <wp:docPr id="6" name="Image3" descr="Uma imagem com Tipo de letra, Gráficos, logótipo, design&#10;&#10;Os conteúdos gerados por IA podem estar incorretos."/>
+          <wp:docPr id="9" name="Image3" descr="Uma imagem com Tipo de letra, Gráficos, logótipo, design&#10;&#10;Os conteúdos gerados por IA podem estar incorretos."/>
           <wp:cNvGraphicFramePr>
             <a:graphicFrameLocks xmlns:a="http://schemas.openxmlformats.org/drawingml/2006/main" noChangeAspect="1"/>
           </wp:cNvGraphicFramePr>
@@ -3855,7 +4763,7 @@
             <a:graphicData uri="http://schemas.openxmlformats.org/drawingml/2006/picture">
               <pic:pic xmlns:pic="http://schemas.openxmlformats.org/drawingml/2006/picture">
                 <pic:nvPicPr>
-                  <pic:cNvPr id="6" name="Image3" descr="Uma imagem com Tipo de letra, Gráficos, logótipo, design&#10;&#10;Os conteúdos gerados por IA podem estar incorretos."/>
+                  <pic:cNvPr id="9" name="Image3" descr="Uma imagem com Tipo de letra, Gráficos, logótipo, design&#10;&#10;Os conteúdos gerados por IA podem estar incorretos."/>
                   <pic:cNvPicPr>
                     <a:picLocks noChangeAspect="1" noChangeArrowheads="1"/>
                   </pic:cNvPicPr>
@@ -5035,6 +5943,14 @@
       <w:rFonts w:ascii="OpenSymbol" w:hAnsi="OpenSymbol" w:eastAsia="OpenSymbol" w:cs="OpenSymbol"/>
     </w:rPr>
   </w:style>
+  <w:style w:type="character" w:styleId="StrongEmphasis">
+    <w:name w:val="Strong Emphasis"/>
+    <w:qFormat/>
+    <w:rPr>
+      <w:b/>
+      <w:bCs/>
+    </w:rPr>
+  </w:style>
   <w:style w:type="paragraph" w:styleId="Heading">
     <w:name w:val="Heading"/>
     <w:basedOn w:val="Normal"/>

</xml_diff>

<commit_message>
docs(report): Completed the report and README of the project
</commit_message>
<xml_diff>
--- a/PROJECT_A/report_projeto_a.docx
+++ b/PROJECT_A/report_projeto_a.docx
@@ -4040,7 +4040,7 @@
           <w:shd w:fill="FFFF00" w:val="clear"/>
           <w:lang w:val="pt-PT" w:eastAsia="en-US" w:bidi="ar-SA"/>
         </w:rPr>
-        <w:t>(Existe um ficheiro README que explica como utilizar o script de avaliação métrica).</w:t>
+        <w:t>(Existe um ficheiro README que explica como utilizar o script de avaliação métrica e o script em python foi usado inteligência artificial a aprtir da ferramenta copilot).</w:t>
       </w:r>
       <w:r>
         <w:rPr>
@@ -4585,6 +4585,54 @@
           <w:rFonts w:ascii="Times New Roman" w:hAnsi="Times New Roman" w:cs="Times New Roman"/>
         </w:rPr>
       </w:pPr>
+      <w:hyperlink r:id="rId15">
+        <w:r>
+          <w:rPr>
+            <w:rStyle w:val="InternetLink"/>
+            <w:rFonts w:eastAsia="Aptos" w:cs="" w:cstheme="minorBidi" w:eastAsiaTheme="minorHAnsi"/>
+            <w:color w:val="auto"/>
+            <w:kern w:val="2"/>
+            <w:sz w:val="22"/>
+            <w:szCs w:val="22"/>
+            <w:lang w:val="pt-PT" w:eastAsia="en-US" w:bidi="ar-SA"/>
+            <w14:ligatures w14:val="standardContextual"/>
+          </w:rPr>
+          <w:t>https://chatgpt.com/share/69124dc9-5804-8007-913e-a67a856629a6</w:t>
+        </w:r>
+      </w:hyperlink>
+    </w:p>
+    <w:p>
+      <w:pPr>
+        <w:pStyle w:val="Normal"/>
+        <w:spacing w:before="0" w:after="160"/>
+        <w:rPr>
+          <w:rFonts w:ascii="Times New Roman" w:hAnsi="Times New Roman" w:cs="Times New Roman"/>
+        </w:rPr>
+      </w:pPr>
+      <w:hyperlink r:id="rId17">
+        <w:r>
+          <w:rPr>
+            <w:rStyle w:val="InternetLink"/>
+            <w:rFonts w:eastAsia="Aptos" w:cs="" w:cstheme="minorBidi" w:eastAsiaTheme="minorHAnsi"/>
+            <w:color w:val="auto"/>
+            <w:kern w:val="2"/>
+            <w:sz w:val="22"/>
+            <w:szCs w:val="22"/>
+            <w:lang w:val="pt-PT" w:eastAsia="en-US" w:bidi="ar-SA"/>
+            <w14:ligatures w14:val="standardContextual"/>
+          </w:rPr>
+          <w:t>https://orange.readthedocs.io/en/latest/reference/rst/Orange.classification.tree.html</w:t>
+        </w:r>
+      </w:hyperlink>
+    </w:p>
+    <w:p>
+      <w:pPr>
+        <w:pStyle w:val="Normal"/>
+        <w:spacing w:before="0" w:after="160"/>
+        <w:rPr>
+          <w:rFonts w:ascii="Times New Roman" w:hAnsi="Times New Roman" w:cs="Times New Roman"/>
+        </w:rPr>
+      </w:pPr>
       <w:r>
         <w:rPr>
           <w:rFonts w:eastAsia="Aptos" w:cs="" w:cstheme="minorBidi" w:eastAsiaTheme="minorHAnsi"/>
@@ -4595,14 +4643,14 @@
           <w:lang w:val="pt-PT" w:eastAsia="en-US" w:bidi="ar-SA"/>
           <w14:ligatures w14:val="standardContextual"/>
         </w:rPr>
-        <w:t>https://chatgpt.com/share/69124dc9-5804-8007-913e-a67a856629a6</w:t>
+        <w:t>https://www.tandfonline.com/doi/pdf/10.1080/08839514.2018.1447479</w:t>
       </w:r>
     </w:p>
     <w:sectPr>
-      <w:headerReference w:type="default" r:id="rId14"/>
-      <w:headerReference w:type="first" r:id="rId15"/>
-      <w:footerReference w:type="default" r:id="rId16"/>
-      <w:footerReference w:type="first" r:id="rId17"/>
+      <w:headerReference w:type="default" r:id="rId18"/>
+      <w:headerReference w:type="first" r:id="rId19"/>
+      <w:footerReference w:type="default" r:id="rId20"/>
+      <w:footerReference w:type="first" r:id="rId21"/>
       <w:type w:val="nextPage"/>
       <w:pgSz w:w="11906" w:h="16838"/>
       <w:pgMar w:left="1701" w:right="1701" w:gutter="0" w:header="708" w:top="1417" w:footer="708" w:bottom="1417"/>
@@ -4624,7 +4672,7 @@
         <w:docPartGallery w:val="Page Numbers (Bottom of Page)"/>
         <w:docPartUnique w:val="true"/>
       </w:docPartObj>
-      <w:id w:val="2138627815"/>
+      <w:id w:val="462912019"/>
     </w:sdtPr>
     <w:sdtContent>
       <w:p>

</xml_diff>